<commit_message>
Final push; final version
</commit_message>
<xml_diff>
--- a/docs/A3_CITP_PowerRanger.docx
+++ b/docs/A3_CITP_PowerRanger.docx
@@ -218,6 +218,7 @@
         </w:rPr>
         <w:t>(</w:t>
       </w:r>
+      <w:proofErr w:type="gramStart"/>
       <w:r>
         <w:rPr>
           <w:rFonts w:ascii="Arial" w:eastAsia="Arial" w:hAnsi="Arial" w:cs="Arial"/>
@@ -239,6 +240,7 @@
         </w:rPr>
         <w:t>•</w:t>
       </w:r>
+      <w:proofErr w:type="gramEnd"/>
       <w:r>
         <w:rPr>
           <w:rFonts w:ascii="Arial" w:eastAsia="Arial" w:hAnsi="Arial" w:cs="Arial"/>
@@ -272,78 +274,123 @@
           <w:rFonts w:ascii="Arial" w:eastAsia="Arial" w:hAnsi="Arial" w:cs="Arial"/>
           <w:color w:val="000000"/>
         </w:rPr>
-        <w:t xml:space="preserve">Glenny Veneesha (14728594) </w:t>
-      </w:r>
+        <w:t xml:space="preserve">Glenny </w:t>
+      </w:r>
+      <w:proofErr w:type="spellStart"/>
       <w:r>
         <w:rPr>
           <w:rFonts w:ascii="Arial" w:eastAsia="Arial" w:hAnsi="Arial" w:cs="Arial"/>
           <w:color w:val="000000"/>
         </w:rPr>
-        <w:t>•</w:t>
-      </w:r>
+        <w:t>Veneesha</w:t>
+      </w:r>
+      <w:proofErr w:type="spellEnd"/>
       <w:r>
         <w:rPr>
           <w:rFonts w:ascii="Arial" w:eastAsia="Arial" w:hAnsi="Arial" w:cs="Arial"/>
           <w:color w:val="000000"/>
         </w:rPr>
-        <w:t xml:space="preserve"> </w:t>
-      </w:r>
+        <w:t xml:space="preserve"> (</w:t>
+      </w:r>
+      <w:proofErr w:type="gramStart"/>
       <w:r>
         <w:rPr>
           <w:rFonts w:ascii="Arial" w:eastAsia="Arial" w:hAnsi="Arial" w:cs="Arial"/>
           <w:color w:val="000000"/>
         </w:rPr>
-        <w:t>Hangyeon Cho (</w:t>
+        <w:t xml:space="preserve">14728594) </w:t>
       </w:r>
       <w:r>
         <w:rPr>
           <w:rFonts w:ascii="Arial" w:eastAsia="Arial" w:hAnsi="Arial" w:cs="Arial"/>
           <w:color w:val="000000"/>
         </w:rPr>
-        <w:t>14730283</w:t>
-      </w:r>
+        <w:t>•</w:t>
+      </w:r>
+      <w:proofErr w:type="gramEnd"/>
       <w:r>
         <w:rPr>
           <w:rFonts w:ascii="Arial" w:eastAsia="Arial" w:hAnsi="Arial" w:cs="Arial"/>
           <w:color w:val="000000"/>
         </w:rPr>
-        <w:t xml:space="preserve">) </w:t>
-      </w:r>
+        <w:t xml:space="preserve"> </w:t>
+      </w:r>
+      <w:proofErr w:type="spellStart"/>
       <w:r>
         <w:rPr>
           <w:rFonts w:ascii="Arial" w:eastAsia="Arial" w:hAnsi="Arial" w:cs="Arial"/>
           <w:color w:val="000000"/>
         </w:rPr>
-        <w:br/>
-      </w:r>
+        <w:t>Hangyeon</w:t>
+      </w:r>
+      <w:proofErr w:type="spellEnd"/>
       <w:r>
         <w:rPr>
           <w:rFonts w:ascii="Arial" w:eastAsia="Arial" w:hAnsi="Arial" w:cs="Arial"/>
           <w:color w:val="000000"/>
         </w:rPr>
-        <w:t>Karell Yusdygo(</w:t>
+        <w:t xml:space="preserve"> Cho (</w:t>
       </w:r>
       <w:r>
         <w:rPr>
           <w:rFonts w:ascii="Arial" w:eastAsia="Arial" w:hAnsi="Arial" w:cs="Arial"/>
           <w:color w:val="000000"/>
         </w:rPr>
-        <w:t>14730295</w:t>
+        <w:t>14730283</w:t>
       </w:r>
       <w:r>
         <w:rPr>
           <w:rFonts w:ascii="Arial" w:eastAsia="Arial" w:hAnsi="Arial" w:cs="Arial"/>
           <w:color w:val="000000"/>
         </w:rPr>
-        <w:t xml:space="preserve">)  </w:t>
+        <w:t xml:space="preserve">) </w:t>
       </w:r>
       <w:r>
         <w:rPr>
           <w:rFonts w:ascii="Arial" w:eastAsia="Arial" w:hAnsi="Arial" w:cs="Arial"/>
           <w:color w:val="000000"/>
         </w:rPr>
+        <w:br/>
+      </w:r>
+      <w:r>
+        <w:rPr>
+          <w:rFonts w:ascii="Arial" w:eastAsia="Arial" w:hAnsi="Arial" w:cs="Arial"/>
+          <w:color w:val="000000"/>
+        </w:rPr>
+        <w:t xml:space="preserve">Karell </w:t>
+      </w:r>
+      <w:proofErr w:type="gramStart"/>
+      <w:r>
+        <w:rPr>
+          <w:rFonts w:ascii="Arial" w:eastAsia="Arial" w:hAnsi="Arial" w:cs="Arial"/>
+          <w:color w:val="000000"/>
+        </w:rPr>
+        <w:t>Yusdygo(</w:t>
+      </w:r>
+      <w:proofErr w:type="gramEnd"/>
+      <w:r>
+        <w:rPr>
+          <w:rFonts w:ascii="Arial" w:eastAsia="Arial" w:hAnsi="Arial" w:cs="Arial"/>
+          <w:color w:val="000000"/>
+        </w:rPr>
+        <w:t>14730295</w:t>
+      </w:r>
+      <w:proofErr w:type="gramStart"/>
+      <w:r>
+        <w:rPr>
+          <w:rFonts w:ascii="Arial" w:eastAsia="Arial" w:hAnsi="Arial" w:cs="Arial"/>
+          <w:color w:val="000000"/>
+        </w:rPr>
+        <w:t xml:space="preserve">)  </w:t>
+      </w:r>
+      <w:r>
+        <w:rPr>
+          <w:rFonts w:ascii="Arial" w:eastAsia="Arial" w:hAnsi="Arial" w:cs="Arial"/>
+          <w:color w:val="000000"/>
+        </w:rPr>
         <w:t>•</w:t>
       </w:r>
+      <w:proofErr w:type="gramEnd"/>
       <w:r>
         <w:rPr>
           <w:rFonts w:ascii="Arial" w:eastAsia="Arial" w:hAnsi="Arial" w:cs="Arial"/>
@@ -415,7 +462,31 @@
           <w:sz w:val="24"/>
           <w:lang w:val="en-ID"/>
         </w:rPr>
-        <w:t>Weed Management in Lama Lama Country: A Design Proposal</w:t>
+        <w:t xml:space="preserve">Weed Management in Lama </w:t>
+      </w:r>
+      <w:proofErr w:type="spellStart"/>
+      <w:r>
+        <w:rPr>
+          <w:rFonts w:ascii="Arial" w:eastAsia="Arial" w:hAnsi="Arial" w:cs="Arial"/>
+          <w:b/>
+          <w:bCs/>
+          <w:color w:val="000000"/>
+          <w:sz w:val="24"/>
+          <w:lang w:val="en-ID"/>
+        </w:rPr>
+        <w:t>Lama</w:t>
+      </w:r>
+      <w:proofErr w:type="spellEnd"/>
+      <w:r>
+        <w:rPr>
+          <w:rFonts w:ascii="Arial" w:eastAsia="Arial" w:hAnsi="Arial" w:cs="Arial"/>
+          <w:b/>
+          <w:bCs/>
+          <w:color w:val="000000"/>
+          <w:sz w:val="24"/>
+          <w:lang w:val="en-ID"/>
+        </w:rPr>
+        <w:t xml:space="preserve"> Country: A Design Proposal</w:t>
       </w:r>
     </w:p>
     <w:p>
@@ -683,6 +754,12 @@
           <w:rFonts w:ascii="Arial" w:hAnsi="Arial" w:cs="Arial"/>
         </w:rPr>
         <w:tab/>
+      </w:r>
+      <w:proofErr w:type="gramStart"/>
+      <w:r>
+        <w:rPr>
+          <w:rFonts w:ascii="Arial" w:hAnsi="Arial" w:cs="Arial"/>
+        </w:rPr>
         <w:t xml:space="preserve">: </w:t>
       </w:r>
       <w:r>
@@ -699,7 +776,18 @@
           <w:lang w:val="en-ID" w:eastAsia="en-US"/>
           <w14:ligatures w14:val="none"/>
         </w:rPr>
-        <w:t>Weed management innovation</w:t>
+        <w:t>Weed</w:t>
+      </w:r>
+      <w:proofErr w:type="gramEnd"/>
+      <w:r>
+        <w:rPr>
+          <w:rFonts w:ascii="Arial" w:eastAsia="Calibri" w:hAnsi="Arial" w:cs="Arial"/>
+          <w:kern w:val="0"/>
+          <w:szCs w:val="22"/>
+          <w:lang w:val="en-ID" w:eastAsia="en-US"/>
+          <w14:ligatures w14:val="none"/>
+        </w:rPr>
+        <w:t xml:space="preserve"> management innovation</w:t>
       </w:r>
     </w:p>
     <w:p>
@@ -1045,8 +1133,17 @@
                 <w:rFonts w:ascii="Arial" w:eastAsia="Arial" w:hAnsi="Arial" w:cs="Arial"/>
                 <w:color w:val="000000"/>
               </w:rPr>
-              <w:t>Glenny Veneesha</w:t>
-            </w:r>
+              <w:t xml:space="preserve">Glenny </w:t>
+            </w:r>
+            <w:proofErr w:type="spellStart"/>
+            <w:r>
+              <w:rPr>
+                <w:rFonts w:ascii="Arial" w:eastAsia="Arial" w:hAnsi="Arial" w:cs="Arial"/>
+                <w:color w:val="000000"/>
+              </w:rPr>
+              <w:t>Veneesha</w:t>
+            </w:r>
+            <w:proofErr w:type="spellEnd"/>
           </w:p>
         </w:tc>
         <w:tc>
@@ -1103,13 +1200,23 @@
                 <w:lang w:val="en-ID" w:eastAsia="en-US" w:bidi="en-AU"/>
               </w:rPr>
             </w:pPr>
+            <w:proofErr w:type="spellStart"/>
             <w:r>
               <w:rPr>
                 <w:rFonts w:ascii="Arial" w:eastAsia="Calibri" w:hAnsi="Arial" w:cs="Arial"/>
                 <w:szCs w:val="22"/>
                 <w:lang w:val="en-ID" w:eastAsia="en-US" w:bidi="en-AU"/>
               </w:rPr>
-              <w:t>Hangyeon Cho</w:t>
+              <w:t>Hangyeon</w:t>
+            </w:r>
+            <w:proofErr w:type="spellEnd"/>
+            <w:r>
+              <w:rPr>
+                <w:rFonts w:ascii="Arial" w:eastAsia="Calibri" w:hAnsi="Arial" w:cs="Arial"/>
+                <w:szCs w:val="22"/>
+                <w:lang w:val="en-ID" w:eastAsia="en-US" w:bidi="en-AU"/>
+              </w:rPr>
+              <w:t xml:space="preserve"> Cho</w:t>
             </w:r>
           </w:p>
         </w:tc>
@@ -1268,7 +1375,25 @@
                 <w:szCs w:val="22"/>
                 <w:lang w:eastAsia="en-US" w:bidi="en-AU"/>
               </w:rPr>
-              <w:t>Developed the introduction to Lama Lama Country and background research. Contributed ideas for the website interface and body and participated in reviewing the final report and website.</w:t>
+              <w:t xml:space="preserve">Developed the introduction to Lama </w:t>
+            </w:r>
+            <w:proofErr w:type="spellStart"/>
+            <w:r>
+              <w:rPr>
+                <w:rFonts w:ascii="Arial" w:eastAsia="Calibri" w:hAnsi="Arial" w:cs="Arial"/>
+                <w:szCs w:val="22"/>
+                <w:lang w:eastAsia="en-US" w:bidi="en-AU"/>
+              </w:rPr>
+              <w:t>Lama</w:t>
+            </w:r>
+            <w:proofErr w:type="spellEnd"/>
+            <w:r>
+              <w:rPr>
+                <w:rFonts w:ascii="Arial" w:eastAsia="Calibri" w:hAnsi="Arial" w:cs="Arial"/>
+                <w:szCs w:val="22"/>
+                <w:lang w:eastAsia="en-US" w:bidi="en-AU"/>
+              </w:rPr>
+              <w:t xml:space="preserve"> Country and background research. Contributed ideas for the website interface and body and participated in reviewing the final report and website.</w:t>
             </w:r>
           </w:p>
         </w:tc>
@@ -1326,9 +1451,9 @@
         <w:rPr>
           <w:rFonts w:ascii="Arial" w:eastAsia="Calibri" w:hAnsi="Arial" w:cs="Arial"/>
           <w:szCs w:val="22"/>
-          <w:lang w:eastAsia="en-US" w:bidi="en-AU"/>
-        </w:rPr>
-        <w:t xml:space="preserve">We acknowledge and pay respect to the Traditional Owners of the land on which we meet; the Gadigal people of the Eora Nation. It is upon their ancestral lands that UTS stands. </w:t>
+          <w:lang w:val="en-ID" w:eastAsia="en-US" w:bidi="en-AU"/>
+        </w:rPr>
+        <w:t>We acknowledge and pay respect to the Traditional Owners of the land on which we meet; the Gadigal people of the Eora Nation. It is upon their ancestral lands that UTS stands.</w:t>
       </w:r>
     </w:p>
     <w:p>
@@ -1345,18 +1470,63 @@
         <w:rPr>
           <w:rFonts w:ascii="Arial" w:eastAsia="Calibri" w:hAnsi="Arial" w:cs="Arial"/>
           <w:szCs w:val="22"/>
-          <w:lang w:eastAsia="en-US" w:bidi="en-AU"/>
-        </w:rPr>
-        <w:t>We also pay respect to the Elders both past and present, acknowledging them as the traditional custodians of knowledge for this land</w:t>
-      </w:r>
+          <w:lang w:val="en-ID" w:eastAsia="en-US" w:bidi="en-AU"/>
+        </w:rPr>
+        <w:t xml:space="preserve">We also acknowledge the Lama </w:t>
+      </w:r>
+      <w:proofErr w:type="spellStart"/>
       <w:r>
         <w:rPr>
           <w:rFonts w:ascii="Arial" w:eastAsia="Calibri" w:hAnsi="Arial" w:cs="Arial"/>
-          <w:sz w:val="28"/>
-          <w:szCs w:val="28"/>
-          <w:lang w:eastAsia="en-US" w:bidi="en-AU"/>
-        </w:rPr>
-        <w:t>.</w:t>
+          <w:szCs w:val="22"/>
+          <w:lang w:val="en-ID" w:eastAsia="en-US" w:bidi="en-AU"/>
+        </w:rPr>
+        <w:t>Lama</w:t>
+      </w:r>
+      <w:proofErr w:type="spellEnd"/>
+      <w:r>
+        <w:rPr>
+          <w:rFonts w:ascii="Arial" w:eastAsia="Calibri" w:hAnsi="Arial" w:cs="Arial"/>
+          <w:szCs w:val="22"/>
+          <w:lang w:val="en-ID" w:eastAsia="en-US" w:bidi="en-AU"/>
+        </w:rPr>
+        <w:t xml:space="preserve"> people, Traditional Owners of Lama </w:t>
+      </w:r>
+      <w:proofErr w:type="spellStart"/>
+      <w:r>
+        <w:rPr>
+          <w:rFonts w:ascii="Arial" w:eastAsia="Calibri" w:hAnsi="Arial" w:cs="Arial"/>
+          <w:szCs w:val="22"/>
+          <w:lang w:val="en-ID" w:eastAsia="en-US" w:bidi="en-AU"/>
+        </w:rPr>
+        <w:t>Lama</w:t>
+      </w:r>
+      <w:proofErr w:type="spellEnd"/>
+      <w:r>
+        <w:rPr>
+          <w:rFonts w:ascii="Arial" w:eastAsia="Calibri" w:hAnsi="Arial" w:cs="Arial"/>
+          <w:szCs w:val="22"/>
+          <w:lang w:val="en-ID" w:eastAsia="en-US" w:bidi="en-AU"/>
+        </w:rPr>
+        <w:t xml:space="preserve"> Country in Cape York, and pay our respects to their Elders past and present. This project was developed to support the work of the Lama </w:t>
+      </w:r>
+      <w:proofErr w:type="spellStart"/>
+      <w:r>
+        <w:rPr>
+          <w:rFonts w:ascii="Arial" w:eastAsia="Calibri" w:hAnsi="Arial" w:cs="Arial"/>
+          <w:szCs w:val="22"/>
+          <w:lang w:val="en-ID" w:eastAsia="en-US" w:bidi="en-AU"/>
+        </w:rPr>
+        <w:t>Lama</w:t>
+      </w:r>
+      <w:proofErr w:type="spellEnd"/>
+      <w:r>
+        <w:rPr>
+          <w:rFonts w:ascii="Arial" w:eastAsia="Calibri" w:hAnsi="Arial" w:cs="Arial"/>
+          <w:szCs w:val="22"/>
+          <w:lang w:val="en-ID" w:eastAsia="en-US" w:bidi="en-AU"/>
+        </w:rPr>
+        <w:t xml:space="preserve"> Rangers in caring for Country.</w:t>
       </w:r>
     </w:p>
     <w:p>
@@ -1381,22 +1551,6 @@
         </w:rPr>
         <w:br w:type="page"/>
       </w:r>
-    </w:p>
-    <w:p>
-      <w:pPr>
-        <w:spacing w:line="278" w:lineRule="auto"/>
-        <w:ind w:leftChars="0" w:left="0" w:firstLineChars="0" w:firstLine="0"/>
-        <w:rPr>
-          <w:rFonts w:ascii="Arial" w:eastAsia="Calibri" w:hAnsi="Arial" w:cs="Arial"/>
-          <w:b/>
-          <w:bCs/>
-          <w:kern w:val="0"/>
-          <w:sz w:val="28"/>
-          <w:szCs w:val="28"/>
-          <w:lang w:val="en-ID" w:eastAsia="en-US"/>
-          <w14:ligatures w14:val="none"/>
-        </w:rPr>
-      </w:pPr>
       <w:r>
         <w:rPr>
           <w:rFonts w:ascii="Arial" w:eastAsia="Calibri" w:hAnsi="Arial" w:cs="Arial"/>
@@ -1522,7 +1676,79 @@
           <w:lang w:val="en-ID" w:eastAsia="en-US"/>
           <w14:ligatures w14:val="none"/>
         </w:rPr>
-        <w:t xml:space="preserve">The Lama Lama Ranger Program, supported by the Yintjingga Aboriginal Corporation (YAC), manages the natural and cultural resources across Lama Lama Country's vast and remote landscape. However, seasonal wet conditions cause impassable roads and river crossings, severely restricting ranger mobility and communication. Because invasive weeds threaten native vegetation, biodiversity, and cultural access, rangers currently utilize manual logging, GPS tagging, and tools like </w:t>
+        <w:t xml:space="preserve">The Lama </w:t>
+      </w:r>
+      <w:proofErr w:type="spellStart"/>
+      <w:r>
+        <w:rPr>
+          <w:rFonts w:ascii="Arial" w:eastAsia="Calibri" w:hAnsi="Arial" w:cs="Arial"/>
+          <w:color w:val="000000"/>
+          <w:kern w:val="0"/>
+          <w:szCs w:val="22"/>
+          <w:lang w:val="en-ID" w:eastAsia="en-US"/>
+          <w14:ligatures w14:val="none"/>
+        </w:rPr>
+        <w:t>Lama</w:t>
+      </w:r>
+      <w:proofErr w:type="spellEnd"/>
+      <w:r>
+        <w:rPr>
+          <w:rFonts w:ascii="Arial" w:eastAsia="Calibri" w:hAnsi="Arial" w:cs="Arial"/>
+          <w:color w:val="000000"/>
+          <w:kern w:val="0"/>
+          <w:szCs w:val="22"/>
+          <w:lang w:val="en-ID" w:eastAsia="en-US"/>
+          <w14:ligatures w14:val="none"/>
+        </w:rPr>
+        <w:t xml:space="preserve"> Ranger Program, supported by the </w:t>
+      </w:r>
+      <w:proofErr w:type="spellStart"/>
+      <w:r>
+        <w:rPr>
+          <w:rFonts w:ascii="Arial" w:eastAsia="Calibri" w:hAnsi="Arial" w:cs="Arial"/>
+          <w:color w:val="000000"/>
+          <w:kern w:val="0"/>
+          <w:szCs w:val="22"/>
+          <w:lang w:val="en-ID" w:eastAsia="en-US"/>
+          <w14:ligatures w14:val="none"/>
+        </w:rPr>
+        <w:t>Yintjingga</w:t>
+      </w:r>
+      <w:proofErr w:type="spellEnd"/>
+      <w:r>
+        <w:rPr>
+          <w:rFonts w:ascii="Arial" w:eastAsia="Calibri" w:hAnsi="Arial" w:cs="Arial"/>
+          <w:color w:val="000000"/>
+          <w:kern w:val="0"/>
+          <w:szCs w:val="22"/>
+          <w:lang w:val="en-ID" w:eastAsia="en-US"/>
+          <w14:ligatures w14:val="none"/>
+        </w:rPr>
+        <w:t xml:space="preserve"> Aboriginal Corporation (YAC), manages the natural and cultural resources across Lama </w:t>
+      </w:r>
+      <w:proofErr w:type="spellStart"/>
+      <w:r>
+        <w:rPr>
+          <w:rFonts w:ascii="Arial" w:eastAsia="Calibri" w:hAnsi="Arial" w:cs="Arial"/>
+          <w:color w:val="000000"/>
+          <w:kern w:val="0"/>
+          <w:szCs w:val="22"/>
+          <w:lang w:val="en-ID" w:eastAsia="en-US"/>
+          <w14:ligatures w14:val="none"/>
+        </w:rPr>
+        <w:t>Lama</w:t>
+      </w:r>
+      <w:proofErr w:type="spellEnd"/>
+      <w:r>
+        <w:rPr>
+          <w:rFonts w:ascii="Arial" w:eastAsia="Calibri" w:hAnsi="Arial" w:cs="Arial"/>
+          <w:color w:val="000000"/>
+          <w:kern w:val="0"/>
+          <w:szCs w:val="22"/>
+          <w:lang w:val="en-ID" w:eastAsia="en-US"/>
+          <w14:ligatures w14:val="none"/>
+        </w:rPr>
+        <w:t xml:space="preserve"> Country's vast and remote landscape. However, seasonal wet conditions cause impassable roads and river crossings, severely restricting ranger mobility and communication. Because invasive weeds threaten native vegetation, biodiversity, and cultural access, rangers currently utilize manual logging, GPS tagging, and tools like </w:t>
       </w:r>
       <w:r>
         <w:rPr>
@@ -1606,7 +1832,29 @@
           <w:lang w:val="en-ID" w:eastAsia="en-US"/>
           <w14:ligatures w14:val="none"/>
         </w:rPr>
-        <w:t>The project aims to address the difficulty Lama Lama Rangers have in reliably detecting, monitoring and prioritising weed infestations across large, remote and seasonally inaccessible Country through an offline-first mobile application. The app saves each infestation’s photo, GPS location, species and treatment on the Ranger’s phone and synchronises it when a connection returns. It flags sites due for follow-up and ranks them by urgency, so Rangers can decide where to work next while their existing practices and knowledge stay at the centre.</w:t>
+        <w:t xml:space="preserve">The project aims to address the difficulty Lama </w:t>
+      </w:r>
+      <w:proofErr w:type="spellStart"/>
+      <w:r>
+        <w:rPr>
+          <w:rFonts w:ascii="Arial" w:eastAsia="Calibri" w:hAnsi="Arial" w:cs="Arial"/>
+          <w:kern w:val="0"/>
+          <w:szCs w:val="22"/>
+          <w:lang w:val="en-ID" w:eastAsia="en-US"/>
+          <w14:ligatures w14:val="none"/>
+        </w:rPr>
+        <w:t>Lama</w:t>
+      </w:r>
+      <w:proofErr w:type="spellEnd"/>
+      <w:r>
+        <w:rPr>
+          <w:rFonts w:ascii="Arial" w:eastAsia="Calibri" w:hAnsi="Arial" w:cs="Arial"/>
+          <w:kern w:val="0"/>
+          <w:szCs w:val="22"/>
+          <w:lang w:val="en-ID" w:eastAsia="en-US"/>
+          <w14:ligatures w14:val="none"/>
+        </w:rPr>
+        <w:t xml:space="preserve"> Rangers have in reliably detecting, monitoring and prioritising weed infestations across large, remote and seasonally inaccessible Country through an offline-first mobile application. The app saves each infestation’s photo, GPS location, species and treatment on the Ranger’s phone and synchronises it when a connection returns. It flags sites due for follow-up and ranks them by urgency, so Rangers can decide where to work next while their existing practices and knowledge stay at the centre.</w:t>
       </w:r>
       <w:r>
         <w:rPr>
@@ -1698,8 +1946,9 @@
           <w:lang w:val="en-ID" w:eastAsia="en-US"/>
           <w14:ligatures w14:val="none"/>
         </w:rPr>
-        <w:t>The implementation is supported through a cross-platform Flutter application, a Supabase database, Ranger training, field testing and documentation</w:t>
-      </w:r>
+        <w:t xml:space="preserve">The implementation is supported through a cross-platform Flutter application, a </w:t>
+      </w:r>
+      <w:proofErr w:type="spellStart"/>
       <w:r>
         <w:rPr>
           <w:rFonts w:ascii="Arial" w:eastAsia="Calibri" w:hAnsi="Arial" w:cs="Arial"/>
@@ -1708,17 +1957,10 @@
           <w:lang w:val="en-ID" w:eastAsia="en-US"/>
           <w14:ligatures w14:val="none"/>
         </w:rPr>
-        <w:t>.</w:t>
-      </w:r>
-    </w:p>
-    <w:p>
-      <w:pPr>
-        <w:numPr>
-          <w:ilvl w:val="0"/>
-          <w:numId w:val="27"/>
-        </w:numPr>
-        <w:spacing w:after="0"/>
-        <w:ind w:leftChars="0" w:left="284" w:firstLineChars="0" w:hanging="284"/>
+        <w:t>Supabase</w:t>
+      </w:r>
+      <w:proofErr w:type="spellEnd"/>
+      <w:r>
         <w:rPr>
           <w:rFonts w:ascii="Arial" w:eastAsia="Calibri" w:hAnsi="Arial" w:cs="Arial"/>
           <w:kern w:val="0"/>
@@ -1726,7 +1968,8 @@
           <w:lang w:val="en-ID" w:eastAsia="en-US"/>
           <w14:ligatures w14:val="none"/>
         </w:rPr>
-      </w:pPr>
+        <w:t xml:space="preserve"> database, Ranger training, field testing and documentation</w:t>
+      </w:r>
       <w:r>
         <w:rPr>
           <w:rFonts w:ascii="Arial" w:eastAsia="Calibri" w:hAnsi="Arial" w:cs="Arial"/>
@@ -1735,9 +1978,17 @@
           <w:lang w:val="en-ID" w:eastAsia="en-US"/>
           <w14:ligatures w14:val="none"/>
         </w:rPr>
-        <w:t xml:space="preserve">The design includes the following components: a mobile app with local storage, photo and GPS capture using the phone, a fixed list of the six priority species from the Weed </w:t>
-      </w:r>
-      <w:r>
+        <w:t>.</w:t>
+      </w:r>
+    </w:p>
+    <w:p>
+      <w:pPr>
+        <w:numPr>
+          <w:ilvl w:val="0"/>
+          <w:numId w:val="27"/>
+        </w:numPr>
+        <w:spacing w:after="0"/>
+        <w:ind w:leftChars="0" w:left="284" w:firstLineChars="0" w:hanging="284"/>
         <w:rPr>
           <w:rFonts w:ascii="Arial" w:eastAsia="Calibri" w:hAnsi="Arial" w:cs="Arial"/>
           <w:kern w:val="0"/>
@@ -1745,18 +1996,8 @@
           <w:lang w:val="en-ID" w:eastAsia="en-US"/>
           <w14:ligatures w14:val="none"/>
         </w:rPr>
-        <w:lastRenderedPageBreak/>
-        <w:t>Action Plan, a prioritisation dashboard with follow-up reminders, a Supabase database with role-based access, and public weed reports that are checked before they are listed.</w:t>
-      </w:r>
-    </w:p>
-    <w:p>
-      <w:pPr>
-        <w:numPr>
-          <w:ilvl w:val="0"/>
-          <w:numId w:val="27"/>
-        </w:numPr>
-        <w:spacing w:after="0"/>
-        <w:ind w:leftChars="0" w:left="284" w:firstLineChars="0" w:hanging="284"/>
+      </w:pPr>
+      <w:r>
         <w:rPr>
           <w:rFonts w:ascii="Arial" w:eastAsia="Calibri" w:hAnsi="Arial" w:cs="Arial"/>
           <w:kern w:val="0"/>
@@ -1764,7 +2005,8 @@
           <w:lang w:val="en-ID" w:eastAsia="en-US"/>
           <w14:ligatures w14:val="none"/>
         </w:rPr>
-      </w:pPr>
+        <w:t xml:space="preserve">The design includes the following components: a mobile app with local storage, photo and GPS capture using the phone, a fixed list of the six priority species from the Weed </w:t>
+      </w:r>
       <w:r>
         <w:rPr>
           <w:rFonts w:ascii="Arial" w:eastAsia="Calibri" w:hAnsi="Arial" w:cs="Arial"/>
@@ -1773,7 +2015,101 @@
           <w:lang w:val="en-ID" w:eastAsia="en-US"/>
           <w14:ligatures w14:val="none"/>
         </w:rPr>
-        <w:t>Lama Lama Rangers use the app in the field to record sites, track treatments and plan return visits. Yintjingga Aboriginal Corporation administrators manage access and review reports, so the Rangers and the corporation stay in control of their information.</w:t>
+        <w:lastRenderedPageBreak/>
+        <w:t xml:space="preserve">Action Plan, a prioritisation dashboard with follow-up reminders, a </w:t>
+      </w:r>
+      <w:proofErr w:type="spellStart"/>
+      <w:r>
+        <w:rPr>
+          <w:rFonts w:ascii="Arial" w:eastAsia="Calibri" w:hAnsi="Arial" w:cs="Arial"/>
+          <w:kern w:val="0"/>
+          <w:szCs w:val="22"/>
+          <w:lang w:val="en-ID" w:eastAsia="en-US"/>
+          <w14:ligatures w14:val="none"/>
+        </w:rPr>
+        <w:t>Supabase</w:t>
+      </w:r>
+      <w:proofErr w:type="spellEnd"/>
+      <w:r>
+        <w:rPr>
+          <w:rFonts w:ascii="Arial" w:eastAsia="Calibri" w:hAnsi="Arial" w:cs="Arial"/>
+          <w:kern w:val="0"/>
+          <w:szCs w:val="22"/>
+          <w:lang w:val="en-ID" w:eastAsia="en-US"/>
+          <w14:ligatures w14:val="none"/>
+        </w:rPr>
+        <w:t xml:space="preserve"> database with role-based access, and public weed reports that are checked before they are listed.</w:t>
+      </w:r>
+    </w:p>
+    <w:p>
+      <w:pPr>
+        <w:numPr>
+          <w:ilvl w:val="0"/>
+          <w:numId w:val="27"/>
+        </w:numPr>
+        <w:spacing w:after="0"/>
+        <w:ind w:leftChars="0" w:left="284" w:firstLineChars="0" w:hanging="284"/>
+        <w:rPr>
+          <w:rFonts w:ascii="Arial" w:eastAsia="Calibri" w:hAnsi="Arial" w:cs="Arial"/>
+          <w:kern w:val="0"/>
+          <w:szCs w:val="22"/>
+          <w:lang w:val="en-ID" w:eastAsia="en-US"/>
+          <w14:ligatures w14:val="none"/>
+        </w:rPr>
+      </w:pPr>
+      <w:r>
+        <w:rPr>
+          <w:rFonts w:ascii="Arial" w:eastAsia="Calibri" w:hAnsi="Arial" w:cs="Arial"/>
+          <w:kern w:val="0"/>
+          <w:szCs w:val="22"/>
+          <w:lang w:val="en-ID" w:eastAsia="en-US"/>
+          <w14:ligatures w14:val="none"/>
+        </w:rPr>
+        <w:t xml:space="preserve">Lama </w:t>
+      </w:r>
+      <w:proofErr w:type="spellStart"/>
+      <w:r>
+        <w:rPr>
+          <w:rFonts w:ascii="Arial" w:eastAsia="Calibri" w:hAnsi="Arial" w:cs="Arial"/>
+          <w:kern w:val="0"/>
+          <w:szCs w:val="22"/>
+          <w:lang w:val="en-ID" w:eastAsia="en-US"/>
+          <w14:ligatures w14:val="none"/>
+        </w:rPr>
+        <w:t>Lama</w:t>
+      </w:r>
+      <w:proofErr w:type="spellEnd"/>
+      <w:r>
+        <w:rPr>
+          <w:rFonts w:ascii="Arial" w:eastAsia="Calibri" w:hAnsi="Arial" w:cs="Arial"/>
+          <w:kern w:val="0"/>
+          <w:szCs w:val="22"/>
+          <w:lang w:val="en-ID" w:eastAsia="en-US"/>
+          <w14:ligatures w14:val="none"/>
+        </w:rPr>
+        <w:t xml:space="preserve"> Rangers use the app in the field to record sites, track treatments and plan return visits. </w:t>
+      </w:r>
+      <w:proofErr w:type="spellStart"/>
+      <w:r>
+        <w:rPr>
+          <w:rFonts w:ascii="Arial" w:eastAsia="Calibri" w:hAnsi="Arial" w:cs="Arial"/>
+          <w:kern w:val="0"/>
+          <w:szCs w:val="22"/>
+          <w:lang w:val="en-ID" w:eastAsia="en-US"/>
+          <w14:ligatures w14:val="none"/>
+        </w:rPr>
+        <w:t>Yintjingga</w:t>
+      </w:r>
+      <w:proofErr w:type="spellEnd"/>
+      <w:r>
+        <w:rPr>
+          <w:rFonts w:ascii="Arial" w:eastAsia="Calibri" w:hAnsi="Arial" w:cs="Arial"/>
+          <w:kern w:val="0"/>
+          <w:szCs w:val="22"/>
+          <w:lang w:val="en-ID" w:eastAsia="en-US"/>
+          <w14:ligatures w14:val="none"/>
+        </w:rPr>
+        <w:t xml:space="preserve"> Aboriginal Corporation administrators manage access and review reports, so the Rangers and the corporation stay in control of their information.</w:t>
       </w:r>
       <w:r>
         <w:rPr>
@@ -1850,7 +2186,29 @@
           <w:lang w:val="en-ID" w:eastAsia="en-US"/>
           <w14:ligatures w14:val="none"/>
         </w:rPr>
-        <w:t>The design needs no specialist hardware and is intended to run on smartphones Rangers already use. The database is an external subscription service (Supabase), so it is sourced externally rather than locally.</w:t>
+        <w:t>The design needs no specialist hardware and is intended to run on smartphones Rangers already use. The database is an external subscription service (</w:t>
+      </w:r>
+      <w:proofErr w:type="spellStart"/>
+      <w:r>
+        <w:rPr>
+          <w:rFonts w:ascii="Arial" w:eastAsia="Calibri" w:hAnsi="Arial" w:cs="Arial"/>
+          <w:kern w:val="0"/>
+          <w:szCs w:val="22"/>
+          <w:lang w:val="en-ID" w:eastAsia="en-US"/>
+          <w14:ligatures w14:val="none"/>
+        </w:rPr>
+        <w:t>Supabase</w:t>
+      </w:r>
+      <w:proofErr w:type="spellEnd"/>
+      <w:r>
+        <w:rPr>
+          <w:rFonts w:ascii="Arial" w:eastAsia="Calibri" w:hAnsi="Arial" w:cs="Arial"/>
+          <w:kern w:val="0"/>
+          <w:szCs w:val="22"/>
+          <w:lang w:val="en-ID" w:eastAsia="en-US"/>
+          <w14:ligatures w14:val="none"/>
+        </w:rPr>
+        <w:t>), so it is sourced externally rather than locally.</w:t>
       </w:r>
     </w:p>
     <w:p>
@@ -1889,7 +2247,29 @@
           <w:lang w:val="en-ID" w:eastAsia="en-US"/>
           <w14:ligatures w14:val="none"/>
         </w:rPr>
-        <w:t>The database subscription must be renewed, the app updated, user accounts managed and a support contact named. Phones are easy to replace and the app can be updated remotely.</w:t>
+        <w:t xml:space="preserve">The database subscription must be renewed, the app updated, user accounts managed and a support contact named. Phones are easy to </w:t>
+      </w:r>
+      <w:proofErr w:type="gramStart"/>
+      <w:r>
+        <w:rPr>
+          <w:rFonts w:ascii="Arial" w:eastAsia="Calibri" w:hAnsi="Arial" w:cs="Arial"/>
+          <w:kern w:val="0"/>
+          <w:szCs w:val="22"/>
+          <w:lang w:val="en-ID" w:eastAsia="en-US"/>
+          <w14:ligatures w14:val="none"/>
+        </w:rPr>
+        <w:t>replace</w:t>
+      </w:r>
+      <w:proofErr w:type="gramEnd"/>
+      <w:r>
+        <w:rPr>
+          <w:rFonts w:ascii="Arial" w:eastAsia="Calibri" w:hAnsi="Arial" w:cs="Arial"/>
+          <w:kern w:val="0"/>
+          <w:szCs w:val="22"/>
+          <w:lang w:val="en-ID" w:eastAsia="en-US"/>
+          <w14:ligatures w14:val="none"/>
+        </w:rPr>
+        <w:t xml:space="preserve"> and the app can be updated remotely.</w:t>
       </w:r>
     </w:p>
     <w:p>
@@ -2129,7 +2509,31 @@
           <w:lang w:val="en-ID" w:eastAsia="en-US"/>
           <w14:ligatures w14:val="none"/>
         </w:rPr>
-        <w:t xml:space="preserve"> hour). Supabase database subscription </w:t>
+        <w:t xml:space="preserve"> hour). </w:t>
+      </w:r>
+      <w:proofErr w:type="spellStart"/>
+      <w:r>
+        <w:rPr>
+          <w:rFonts w:ascii="Arial" w:eastAsia="Calibri" w:hAnsi="Arial" w:cs="Arial"/>
+          <w:color w:val="000000"/>
+          <w:kern w:val="0"/>
+          <w:szCs w:val="22"/>
+          <w:lang w:val="en-ID" w:eastAsia="en-US"/>
+          <w14:ligatures w14:val="none"/>
+        </w:rPr>
+        <w:t>Supabase</w:t>
+      </w:r>
+      <w:proofErr w:type="spellEnd"/>
+      <w:r>
+        <w:rPr>
+          <w:rFonts w:ascii="Arial" w:eastAsia="Calibri" w:hAnsi="Arial" w:cs="Arial"/>
+          <w:color w:val="000000"/>
+          <w:kern w:val="0"/>
+          <w:szCs w:val="22"/>
+          <w:lang w:val="en-ID" w:eastAsia="en-US"/>
+          <w14:ligatures w14:val="none"/>
+        </w:rPr>
+        <w:t xml:space="preserve"> database subscription </w:t>
       </w:r>
       <w:r>
         <w:rPr>
@@ -2320,7 +2724,49 @@
         <w:rPr>
           <w:rFonts w:ascii="Arial" w:hAnsi="Arial" w:cs="Arial"/>
         </w:rPr>
-        <w:t>The Lama Lama Ranger Program is supported by Yintjingga Aboriginal Corporation (YAC), which plays an important role in managing Country and connecting to environmental, economic and cultural values. However, seasonal conditions can create challenges for Ranger activities. During the wet season, roads and tracks may become difficult or impossible to use, limiting Rangers’ access to weed infestation sites. It highlights the need for more efficient and reliable approaches to weed mapping, monitoring and treatment.</w:t>
+        <w:t xml:space="preserve">The Lama </w:t>
+      </w:r>
+      <w:proofErr w:type="spellStart"/>
+      <w:r>
+        <w:rPr>
+          <w:rFonts w:ascii="Arial" w:hAnsi="Arial" w:cs="Arial"/>
+        </w:rPr>
+        <w:t>Lama</w:t>
+      </w:r>
+      <w:proofErr w:type="spellEnd"/>
+      <w:r>
+        <w:rPr>
+          <w:rFonts w:ascii="Arial" w:hAnsi="Arial" w:cs="Arial"/>
+        </w:rPr>
+        <w:t xml:space="preserve"> Ranger Program is supported by </w:t>
+      </w:r>
+      <w:proofErr w:type="spellStart"/>
+      <w:r>
+        <w:rPr>
+          <w:rFonts w:ascii="Arial" w:hAnsi="Arial" w:cs="Arial"/>
+        </w:rPr>
+        <w:t>Yintjingga</w:t>
+      </w:r>
+      <w:proofErr w:type="spellEnd"/>
+      <w:r>
+        <w:rPr>
+          <w:rFonts w:ascii="Arial" w:hAnsi="Arial" w:cs="Arial"/>
+        </w:rPr>
+        <w:t xml:space="preserve"> Aboriginal Corporation (YAC), which plays an important role in managing Country and </w:t>
+      </w:r>
+      <w:proofErr w:type="gramStart"/>
+      <w:r>
+        <w:rPr>
+          <w:rFonts w:ascii="Arial" w:hAnsi="Arial" w:cs="Arial"/>
+        </w:rPr>
+        <w:t>connecting to</w:t>
+      </w:r>
+      <w:proofErr w:type="gramEnd"/>
+      <w:r>
+        <w:rPr>
+          <w:rFonts w:ascii="Arial" w:hAnsi="Arial" w:cs="Arial"/>
+        </w:rPr>
+        <w:t xml:space="preserve"> environmental, economic and cultural values. However, seasonal conditions can create challenges for Ranger activities. During the wet season, roads and tracks may become difficult or impossible to use, limiting Rangers’ access to weed infestation sites. It highlights the need for more efficient and reliable approaches to weed mapping, monitoring and treatment.</w:t>
       </w:r>
     </w:p>
     <w:p>
@@ -2396,7 +2842,35 @@
         <w:rPr>
           <w:rFonts w:ascii="Arial" w:hAnsi="Arial" w:cs="Arial"/>
         </w:rPr>
-        <w:t xml:space="preserve">The Lama Lama Ranger Program is jointly managed by the Queensland Government and the Indigenous community. Rangers are responsible for managing the natural and cultural resources across Lama Lama Country, including a wide range of land and sea management activities. </w:t>
+        <w:t xml:space="preserve">The Lama </w:t>
+      </w:r>
+      <w:proofErr w:type="spellStart"/>
+      <w:r>
+        <w:rPr>
+          <w:rFonts w:ascii="Arial" w:hAnsi="Arial" w:cs="Arial"/>
+        </w:rPr>
+        <w:t>Lama</w:t>
+      </w:r>
+      <w:proofErr w:type="spellEnd"/>
+      <w:r>
+        <w:rPr>
+          <w:rFonts w:ascii="Arial" w:hAnsi="Arial" w:cs="Arial"/>
+        </w:rPr>
+        <w:t xml:space="preserve"> Ranger Program is jointly managed by the Queensland Government and the Indigenous community. Rangers are responsible for managing the natural and cultural resources across Lama </w:t>
+      </w:r>
+      <w:proofErr w:type="spellStart"/>
+      <w:r>
+        <w:rPr>
+          <w:rFonts w:ascii="Arial" w:hAnsi="Arial" w:cs="Arial"/>
+        </w:rPr>
+        <w:t>Lama</w:t>
+      </w:r>
+      <w:proofErr w:type="spellEnd"/>
+      <w:r>
+        <w:rPr>
+          <w:rFonts w:ascii="Arial" w:hAnsi="Arial" w:cs="Arial"/>
+        </w:rPr>
+        <w:t xml:space="preserve"> Country, including a wide range of land and sea management activities. </w:t>
       </w:r>
     </w:p>
     <w:p>
@@ -2412,7 +2886,21 @@
         <w:rPr>
           <w:rFonts w:ascii="Arial" w:hAnsi="Arial" w:cs="Arial"/>
         </w:rPr>
-        <w:t xml:space="preserve">Lama Lama Country is large and remote, with diverse terrain and ecosystems. That means </w:t>
+        <w:t xml:space="preserve">Lama </w:t>
+      </w:r>
+      <w:proofErr w:type="spellStart"/>
+      <w:r>
+        <w:rPr>
+          <w:rFonts w:ascii="Arial" w:hAnsi="Arial" w:cs="Arial"/>
+        </w:rPr>
+        <w:t>Lama</w:t>
+      </w:r>
+      <w:proofErr w:type="spellEnd"/>
+      <w:r>
+        <w:rPr>
+          <w:rFonts w:ascii="Arial" w:hAnsi="Arial" w:cs="Arial"/>
+        </w:rPr>
+        <w:t xml:space="preserve"> Country is large and remote, with diverse terrain and ecosystems. That means </w:t>
       </w:r>
       <w:r>
         <w:rPr>
@@ -2424,7 +2912,21 @@
         <w:rPr>
           <w:rFonts w:ascii="Arial" w:hAnsi="Arial" w:cs="Arial"/>
         </w:rPr>
-        <w:t xml:space="preserve">application should be tailored to local conditions, including offline capacity, easy </w:t>
+        <w:t xml:space="preserve">application should be tailored to local conditions, including offline capacity, </w:t>
+      </w:r>
+      <w:proofErr w:type="spellStart"/>
+      <w:r>
+        <w:rPr>
+          <w:rFonts w:ascii="Arial" w:hAnsi="Arial" w:cs="Arial"/>
+        </w:rPr>
+        <w:t>easy</w:t>
+      </w:r>
+      <w:proofErr w:type="spellEnd"/>
+      <w:r>
+        <w:rPr>
+          <w:rFonts w:ascii="Arial" w:hAnsi="Arial" w:cs="Arial"/>
+        </w:rPr>
+        <w:t xml:space="preserve"> </w:t>
       </w:r>
       <w:r>
         <w:rPr>
@@ -2515,7 +3017,35 @@
         <w:rPr>
           <w:rFonts w:ascii="Arial" w:hAnsi="Arial" w:cs="Arial"/>
         </w:rPr>
-        <w:t>Weed management is an important part of managing Lama Lama Country because invasive weeds impact environmental, economic and cultural values (Yintjingga Aboriginal Corporation, n.d.</w:t>
+        <w:t xml:space="preserve">Weed management is an important part of managing Lama </w:t>
+      </w:r>
+      <w:proofErr w:type="spellStart"/>
+      <w:r>
+        <w:rPr>
+          <w:rFonts w:ascii="Arial" w:hAnsi="Arial" w:cs="Arial"/>
+        </w:rPr>
+        <w:t>Lama</w:t>
+      </w:r>
+      <w:proofErr w:type="spellEnd"/>
+      <w:r>
+        <w:rPr>
+          <w:rFonts w:ascii="Arial" w:hAnsi="Arial" w:cs="Arial"/>
+        </w:rPr>
+        <w:t xml:space="preserve"> Country because invasive weeds impact environmental, economic and cultural values (</w:t>
+      </w:r>
+      <w:proofErr w:type="spellStart"/>
+      <w:r>
+        <w:rPr>
+          <w:rFonts w:ascii="Arial" w:hAnsi="Arial" w:cs="Arial"/>
+        </w:rPr>
+        <w:t>Yintjingga</w:t>
+      </w:r>
+      <w:proofErr w:type="spellEnd"/>
+      <w:r>
+        <w:rPr>
+          <w:rFonts w:ascii="Arial" w:hAnsi="Arial" w:cs="Arial"/>
+        </w:rPr>
+        <w:t xml:space="preserve"> Aboriginal Corporation, n.d.</w:t>
       </w:r>
       <w:r>
         <w:rPr>
@@ -2527,7 +3057,21 @@
         <w:rPr>
           <w:rFonts w:ascii="Arial" w:hAnsi="Arial" w:cs="Arial"/>
         </w:rPr>
-        <w:t xml:space="preserve">). Invasive weeds can threaten native vegetation, reduce biodiversity and affect access to important areas of Lama Lama </w:t>
+        <w:t xml:space="preserve">). Invasive weeds can threaten native vegetation, reduce biodiversity and affect access to important areas of Lama </w:t>
+      </w:r>
+      <w:proofErr w:type="spellStart"/>
+      <w:r>
+        <w:rPr>
+          <w:rFonts w:ascii="Arial" w:hAnsi="Arial" w:cs="Arial"/>
+        </w:rPr>
+        <w:t>Lama</w:t>
+      </w:r>
+      <w:proofErr w:type="spellEnd"/>
+      <w:r>
+        <w:rPr>
+          <w:rFonts w:ascii="Arial" w:hAnsi="Arial" w:cs="Arial"/>
+        </w:rPr>
+        <w:t xml:space="preserve"> </w:t>
       </w:r>
       <w:r>
         <w:rPr>
@@ -2776,7 +3320,35 @@
         <w:rPr>
           <w:rFonts w:ascii="Arial" w:hAnsi="Arial" w:cs="Arial"/>
         </w:rPr>
-        <w:t xml:space="preserve"> an application that can improve efficiency and reliability of weed management work across Lama Lama Country. It should support large-scale weed monitoring and help rangers track the effectiveness of treatment. It</w:t>
+        <w:t xml:space="preserve"> an application that can improve efficiency and reliability of weed </w:t>
+      </w:r>
+      <w:proofErr w:type="gramStart"/>
+      <w:r>
+        <w:rPr>
+          <w:rFonts w:ascii="Arial" w:hAnsi="Arial" w:cs="Arial"/>
+        </w:rPr>
+        <w:t>management work</w:t>
+      </w:r>
+      <w:proofErr w:type="gramEnd"/>
+      <w:r>
+        <w:rPr>
+          <w:rFonts w:ascii="Arial" w:hAnsi="Arial" w:cs="Arial"/>
+        </w:rPr>
+        <w:t xml:space="preserve"> across Lama </w:t>
+      </w:r>
+      <w:proofErr w:type="spellStart"/>
+      <w:r>
+        <w:rPr>
+          <w:rFonts w:ascii="Arial" w:hAnsi="Arial" w:cs="Arial"/>
+        </w:rPr>
+        <w:t>Lama</w:t>
+      </w:r>
+      <w:proofErr w:type="spellEnd"/>
+      <w:r>
+        <w:rPr>
+          <w:rFonts w:ascii="Arial" w:hAnsi="Arial" w:cs="Arial"/>
+        </w:rPr>
+        <w:t xml:space="preserve"> Country. It should support large-scale weed monitoring and help rangers track the effectiveness of treatment. It</w:t>
       </w:r>
       <w:r>
         <w:rPr>
@@ -2860,7 +3432,49 @@
         <w:rPr>
           <w:rFonts w:ascii="Arial" w:hAnsi="Arial" w:cs="Arial"/>
         </w:rPr>
-        <w:t>While physical removal is important, the true challenge of weed management on Lama Lama Country lies in reliably detecting, monitoring, and managing infestations across such vast, remote areas. Weeds Australia (n.d.) states that "an important part of any weed control program is monitoring the response of weeds and desirable vegetation" to evaluate whether management goals and control actions have actually worked.</w:t>
+        <w:t xml:space="preserve">While physical removal is important, the true challenge of weed management </w:t>
+      </w:r>
+      <w:proofErr w:type="gramStart"/>
+      <w:r>
+        <w:rPr>
+          <w:rFonts w:ascii="Arial" w:hAnsi="Arial" w:cs="Arial"/>
+        </w:rPr>
+        <w:t>on</w:t>
+      </w:r>
+      <w:proofErr w:type="gramEnd"/>
+      <w:r>
+        <w:rPr>
+          <w:rFonts w:ascii="Arial" w:hAnsi="Arial" w:cs="Arial"/>
+        </w:rPr>
+        <w:t xml:space="preserve"> Lama </w:t>
+      </w:r>
+      <w:proofErr w:type="spellStart"/>
+      <w:r>
+        <w:rPr>
+          <w:rFonts w:ascii="Arial" w:hAnsi="Arial" w:cs="Arial"/>
+        </w:rPr>
+        <w:t>Lama</w:t>
+      </w:r>
+      <w:proofErr w:type="spellEnd"/>
+      <w:r>
+        <w:rPr>
+          <w:rFonts w:ascii="Arial" w:hAnsi="Arial" w:cs="Arial"/>
+        </w:rPr>
+        <w:t xml:space="preserve"> Country lies in reliably detecting, monitoring, and managing infestations across such vast, remote areas. Weeds Australia (n.d.) states that "an important part of any weed control program is monitoring the response of weeds and desirable vegetation" to evaluate whether management goals and control actions have </w:t>
+      </w:r>
+      <w:proofErr w:type="gramStart"/>
+      <w:r>
+        <w:rPr>
+          <w:rFonts w:ascii="Arial" w:hAnsi="Arial" w:cs="Arial"/>
+        </w:rPr>
+        <w:t>actually worked</w:t>
+      </w:r>
+      <w:proofErr w:type="gramEnd"/>
+      <w:r>
+        <w:rPr>
+          <w:rFonts w:ascii="Arial" w:hAnsi="Arial" w:cs="Arial"/>
+        </w:rPr>
+        <w:t>.</w:t>
       </w:r>
       <w:r>
         <w:rPr>
@@ -2937,7 +3551,21 @@
         <w:rPr>
           <w:rFonts w:ascii="Arial" w:hAnsi="Arial" w:cs="Arial"/>
         </w:rPr>
-        <w:t>Infestations on Lama Lama Country are spread across an extensive landscape</w:t>
+        <w:t xml:space="preserve">Infestations on Lama </w:t>
+      </w:r>
+      <w:proofErr w:type="spellStart"/>
+      <w:r>
+        <w:rPr>
+          <w:rFonts w:ascii="Arial" w:hAnsi="Arial" w:cs="Arial"/>
+        </w:rPr>
+        <w:t>Lama</w:t>
+      </w:r>
+      <w:proofErr w:type="spellEnd"/>
+      <w:r>
+        <w:rPr>
+          <w:rFonts w:ascii="Arial" w:hAnsi="Arial" w:cs="Arial"/>
+        </w:rPr>
+        <w:t xml:space="preserve"> Country are spread across an extensive landscape</w:t>
       </w:r>
       <w:r>
         <w:rPr>
@@ -3038,7 +3666,21 @@
         <w:rPr>
           <w:rFonts w:ascii="Arial" w:hAnsi="Arial" w:cs="Arial"/>
         </w:rPr>
-        <w:t>Given these challenges, an infestation record with offline capability is the ideal solution, as it could greatly benefit the Rangers even in the wet season, when access and connectivity are limited. Features such as a location tracker, photos and treatment history could help Rangers return to the treated site on time rather than relying on memory, complemented by a feature that could allow Rangers to see which sites need prioritisation. Moreover, a tool that can be maintained locally, with Rangers and YAC having control of their information, should also be part of the solution.</w:t>
+        <w:t xml:space="preserve">Given these challenges, an infestation record with offline capability is the ideal solution, as it could greatly benefit the Rangers even in the wet season, when access and connectivity are limited. Features such as a location tracker, photos and treatment history could help Rangers return to the treated site on time rather than relying on memory, complemented by a feature that could allow Rangers to see which sites need </w:t>
+      </w:r>
+      <w:proofErr w:type="spellStart"/>
+      <w:r>
+        <w:rPr>
+          <w:rFonts w:ascii="Arial" w:hAnsi="Arial" w:cs="Arial"/>
+        </w:rPr>
+        <w:t>prioritisation</w:t>
+      </w:r>
+      <w:proofErr w:type="spellEnd"/>
+      <w:r>
+        <w:rPr>
+          <w:rFonts w:ascii="Arial" w:hAnsi="Arial" w:cs="Arial"/>
+        </w:rPr>
+        <w:t>. Moreover, a tool that can be maintained locally, with Rangers and YAC having control of their information, should also be part of the solution.</w:t>
       </w:r>
     </w:p>
     <w:p>
@@ -3086,7 +3728,51 @@
           <w:i/>
           <w:iCs/>
         </w:rPr>
-        <w:t>“Lama Lama Rangers need to reliably detect, monitor, and prioritise weed infestations across large, remote and seasonally inaccessible areas while integrating with their existing practices.”</w:t>
+        <w:t xml:space="preserve">“Lama </w:t>
+      </w:r>
+      <w:proofErr w:type="spellStart"/>
+      <w:r>
+        <w:rPr>
+          <w:rFonts w:ascii="Arial" w:hAnsi="Arial" w:cs="Arial"/>
+          <w:b/>
+          <w:bCs/>
+          <w:i/>
+          <w:iCs/>
+        </w:rPr>
+        <w:t>Lama</w:t>
+      </w:r>
+      <w:proofErr w:type="spellEnd"/>
+      <w:r>
+        <w:rPr>
+          <w:rFonts w:ascii="Arial" w:hAnsi="Arial" w:cs="Arial"/>
+          <w:b/>
+          <w:bCs/>
+          <w:i/>
+          <w:iCs/>
+        </w:rPr>
+        <w:t xml:space="preserve"> Rangers need to reliably detect, monitor, and </w:t>
+      </w:r>
+      <w:proofErr w:type="spellStart"/>
+      <w:r>
+        <w:rPr>
+          <w:rFonts w:ascii="Arial" w:hAnsi="Arial" w:cs="Arial"/>
+          <w:b/>
+          <w:bCs/>
+          <w:i/>
+          <w:iCs/>
+        </w:rPr>
+        <w:t>prioritise</w:t>
+      </w:r>
+      <w:proofErr w:type="spellEnd"/>
+      <w:r>
+        <w:rPr>
+          <w:rFonts w:ascii="Arial" w:hAnsi="Arial" w:cs="Arial"/>
+          <w:b/>
+          <w:bCs/>
+          <w:i/>
+          <w:iCs/>
+        </w:rPr>
+        <w:t xml:space="preserve"> weed infestations across large, remote and seasonally inaccessible areas while integrating with their existing practices.”</w:t>
       </w:r>
     </w:p>
     <w:p>
@@ -3351,7 +4037,21 @@
         <w:rPr>
           <w:rFonts w:ascii="Arial" w:hAnsi="Arial" w:cs="Arial"/>
         </w:rPr>
-        <w:t xml:space="preserve"> the user need. Offline usability (20) and remote field operability (20) </w:t>
+        <w:t xml:space="preserve"> the </w:t>
+      </w:r>
+      <w:proofErr w:type="gramStart"/>
+      <w:r>
+        <w:rPr>
+          <w:rFonts w:ascii="Arial" w:hAnsi="Arial" w:cs="Arial"/>
+        </w:rPr>
+        <w:t>user</w:t>
+      </w:r>
+      <w:proofErr w:type="gramEnd"/>
+      <w:r>
+        <w:rPr>
+          <w:rFonts w:ascii="Arial" w:hAnsi="Arial" w:cs="Arial"/>
+        </w:rPr>
+        <w:t xml:space="preserve"> need. Offline usability (20) and remote field operability (20) </w:t>
       </w:r>
       <w:r>
         <w:rPr>
@@ -3375,7 +4075,21 @@
         <w:rPr>
           <w:rFonts w:ascii="Arial" w:hAnsi="Arial" w:cs="Arial"/>
         </w:rPr>
-        <w:t xml:space="preserve"> because most of Lama Lama Country has little signal and infestations are spread over large, remote areas (</w:t>
+        <w:t xml:space="preserve"> because most of Lama </w:t>
+      </w:r>
+      <w:proofErr w:type="spellStart"/>
+      <w:r>
+        <w:rPr>
+          <w:rFonts w:ascii="Arial" w:hAnsi="Arial" w:cs="Arial"/>
+        </w:rPr>
+        <w:t>Lama</w:t>
+      </w:r>
+      <w:proofErr w:type="spellEnd"/>
+      <w:r>
+        <w:rPr>
+          <w:rFonts w:ascii="Arial" w:hAnsi="Arial" w:cs="Arial"/>
+        </w:rPr>
+        <w:t xml:space="preserve"> Country has little signal and infestations are spread over large, remote areas (</w:t>
       </w:r>
       <w:r>
         <w:rPr>
@@ -3503,7 +4217,39 @@
           <w:rFonts w:ascii="Arial" w:hAnsi="Arial" w:cs="Arial"/>
           <w:lang w:val="en-ID"/>
         </w:rPr>
-        <w:t xml:space="preserve"> a solution that could operate within the practical conditions of Lama Lama Country. Particular attention for the proposed solution was given to offline capability, </w:t>
+        <w:t xml:space="preserve"> a solution that could operate within the practical conditions of Lama </w:t>
+      </w:r>
+      <w:proofErr w:type="spellStart"/>
+      <w:r>
+        <w:rPr>
+          <w:rFonts w:ascii="Arial" w:hAnsi="Arial" w:cs="Arial"/>
+          <w:lang w:val="en-ID"/>
+        </w:rPr>
+        <w:t>Lama</w:t>
+      </w:r>
+      <w:proofErr w:type="spellEnd"/>
+      <w:r>
+        <w:rPr>
+          <w:rFonts w:ascii="Arial" w:hAnsi="Arial" w:cs="Arial"/>
+          <w:lang w:val="en-ID"/>
+        </w:rPr>
+        <w:t xml:space="preserve"> Country. </w:t>
+      </w:r>
+      <w:proofErr w:type="gramStart"/>
+      <w:r>
+        <w:rPr>
+          <w:rFonts w:ascii="Arial" w:hAnsi="Arial" w:cs="Arial"/>
+          <w:lang w:val="en-ID"/>
+        </w:rPr>
+        <w:t>Particular attention</w:t>
+      </w:r>
+      <w:proofErr w:type="gramEnd"/>
+      <w:r>
+        <w:rPr>
+          <w:rFonts w:ascii="Arial" w:hAnsi="Arial" w:cs="Arial"/>
+          <w:lang w:val="en-ID"/>
+        </w:rPr>
+        <w:t xml:space="preserve"> for the proposed solution was given to offline capability, </w:t>
       </w:r>
       <w:r>
         <w:rPr>
@@ -3827,7 +4573,27 @@
           <w:szCs w:val="20"/>
           <w:lang w:val="en-ID"/>
         </w:rPr>
-        <w:t>[Lama Lama Ranger using a portable spot-spray device]</w:t>
+        <w:t xml:space="preserve">[Lama </w:t>
+      </w:r>
+      <w:proofErr w:type="spellStart"/>
+      <w:r>
+        <w:rPr>
+          <w:rFonts w:ascii="Arial" w:hAnsi="Arial" w:cs="Arial"/>
+          <w:sz w:val="20"/>
+          <w:szCs w:val="20"/>
+          <w:lang w:val="en-ID"/>
+        </w:rPr>
+        <w:t>Lama</w:t>
+      </w:r>
+      <w:proofErr w:type="spellEnd"/>
+      <w:r>
+        <w:rPr>
+          <w:rFonts w:ascii="Arial" w:hAnsi="Arial" w:cs="Arial"/>
+          <w:sz w:val="20"/>
+          <w:szCs w:val="20"/>
+          <w:lang w:val="en-ID"/>
+        </w:rPr>
+        <w:t xml:space="preserve"> Ranger using a portable spot-spray device]</w:t>
       </w:r>
     </w:p>
     <w:p>
@@ -3971,7 +4737,27 @@
           <w:szCs w:val="20"/>
           <w:lang w:val="en-ID"/>
         </w:rPr>
-        <w:t>[Lama Lama Ranger using an offline weed management application]</w:t>
+        <w:t xml:space="preserve">[Lama </w:t>
+      </w:r>
+      <w:proofErr w:type="spellStart"/>
+      <w:r>
+        <w:rPr>
+          <w:rFonts w:ascii="Arial" w:hAnsi="Arial" w:cs="Arial"/>
+          <w:sz w:val="20"/>
+          <w:szCs w:val="20"/>
+          <w:lang w:val="en-ID"/>
+        </w:rPr>
+        <w:t>Lama</w:t>
+      </w:r>
+      <w:proofErr w:type="spellEnd"/>
+      <w:r>
+        <w:rPr>
+          <w:rFonts w:ascii="Arial" w:hAnsi="Arial" w:cs="Arial"/>
+          <w:sz w:val="20"/>
+          <w:szCs w:val="20"/>
+          <w:lang w:val="en-ID"/>
+        </w:rPr>
+        <w:t xml:space="preserve"> Ranger using an offline weed management application]</w:t>
       </w:r>
     </w:p>
     <w:p>
@@ -4199,7 +4985,27 @@
           <w:szCs w:val="20"/>
           <w:lang w:val="en-ID"/>
         </w:rPr>
-        <w:t>[Lama Lama Ranger using AI photo-based weed identification]</w:t>
+        <w:t xml:space="preserve">[Lama </w:t>
+      </w:r>
+      <w:proofErr w:type="spellStart"/>
+      <w:r>
+        <w:rPr>
+          <w:rFonts w:ascii="Arial" w:hAnsi="Arial" w:cs="Arial"/>
+          <w:sz w:val="20"/>
+          <w:szCs w:val="20"/>
+          <w:lang w:val="en-ID"/>
+        </w:rPr>
+        <w:t>Lama</w:t>
+      </w:r>
+      <w:proofErr w:type="spellEnd"/>
+      <w:r>
+        <w:rPr>
+          <w:rFonts w:ascii="Arial" w:hAnsi="Arial" w:cs="Arial"/>
+          <w:sz w:val="20"/>
+          <w:szCs w:val="20"/>
+          <w:lang w:val="en-ID"/>
+        </w:rPr>
+        <w:t xml:space="preserve"> Ranger using AI photo-based weed identification]</w:t>
       </w:r>
     </w:p>
     <w:p>
@@ -6310,7 +7116,23 @@
           <w:rFonts w:ascii="Arial" w:hAnsi="Arial" w:cs="Arial"/>
           <w:lang w:val="en-ID"/>
         </w:rPr>
-        <w:t xml:space="preserve"> 90–100%: works fully with Lama Lama Country conditions</w:t>
+        <w:t xml:space="preserve"> 90–100%: works fully with Lama </w:t>
+      </w:r>
+      <w:proofErr w:type="spellStart"/>
+      <w:r>
+        <w:rPr>
+          <w:rFonts w:ascii="Arial" w:hAnsi="Arial" w:cs="Arial"/>
+          <w:lang w:val="en-ID"/>
+        </w:rPr>
+        <w:t>Lama</w:t>
+      </w:r>
+      <w:proofErr w:type="spellEnd"/>
+      <w:r>
+        <w:rPr>
+          <w:rFonts w:ascii="Arial" w:hAnsi="Arial" w:cs="Arial"/>
+          <w:lang w:val="en-ID"/>
+        </w:rPr>
+        <w:t xml:space="preserve"> Country conditions</w:t>
       </w:r>
     </w:p>
     <w:p>
@@ -6412,7 +7234,23 @@
           <w:rFonts w:ascii="Arial" w:hAnsi="Arial" w:cs="Arial"/>
           <w:lang w:val="en-ID"/>
         </w:rPr>
-        <w:t xml:space="preserve"> Below 50%: big barriers to use on Lama Lama Country</w:t>
+        <w:t xml:space="preserve"> Below 50%: big barriers to use on Lama </w:t>
+      </w:r>
+      <w:proofErr w:type="spellStart"/>
+      <w:r>
+        <w:rPr>
+          <w:rFonts w:ascii="Arial" w:hAnsi="Arial" w:cs="Arial"/>
+          <w:lang w:val="en-ID"/>
+        </w:rPr>
+        <w:t>Lama</w:t>
+      </w:r>
+      <w:proofErr w:type="spellEnd"/>
+      <w:r>
+        <w:rPr>
+          <w:rFonts w:ascii="Arial" w:hAnsi="Arial" w:cs="Arial"/>
+          <w:lang w:val="en-ID"/>
+        </w:rPr>
+        <w:t xml:space="preserve"> Country</w:t>
       </w:r>
     </w:p>
     <w:p>
@@ -6592,7 +7430,23 @@
           <w:rFonts w:ascii="Arial" w:hAnsi="Arial" w:cs="Arial"/>
           <w:lang w:val="en-ID"/>
         </w:rPr>
-        <w:t>Covers the whole need: finding, keeping track and deciding what comes first. It loses a few points only because Rangers still have to reach a site to spot weeds</w:t>
+        <w:t xml:space="preserve">Covers the whole need: finding, keeping track and deciding what comes first. It loses a few points only because Rangers still </w:t>
+      </w:r>
+      <w:proofErr w:type="gramStart"/>
+      <w:r>
+        <w:rPr>
+          <w:rFonts w:ascii="Arial" w:hAnsi="Arial" w:cs="Arial"/>
+          <w:lang w:val="en-ID"/>
+        </w:rPr>
+        <w:t>have to</w:t>
+      </w:r>
+      <w:proofErr w:type="gramEnd"/>
+      <w:r>
+        <w:rPr>
+          <w:rFonts w:ascii="Arial" w:hAnsi="Arial" w:cs="Arial"/>
+          <w:lang w:val="en-ID"/>
+        </w:rPr>
+        <w:t xml:space="preserve"> reach a site to spot weeds</w:t>
       </w:r>
     </w:p>
     <w:p>
@@ -8109,7 +8963,23 @@
           <w:rFonts w:ascii="Arial" w:hAnsi="Arial" w:cs="Arial"/>
           <w:lang w:val="en-ID"/>
         </w:rPr>
-        <w:t xml:space="preserve"> (Report a weed screen): Photos are kept to compare later visits. Tag: Effectiveness 30/35</w:t>
+        <w:t xml:space="preserve"> (Report a weed screen): Photos are kept </w:t>
+      </w:r>
+      <w:proofErr w:type="gramStart"/>
+      <w:r>
+        <w:rPr>
+          <w:rFonts w:ascii="Arial" w:hAnsi="Arial" w:cs="Arial"/>
+          <w:lang w:val="en-ID"/>
+        </w:rPr>
+        <w:t>to compare</w:t>
+      </w:r>
+      <w:proofErr w:type="gramEnd"/>
+      <w:r>
+        <w:rPr>
+          <w:rFonts w:ascii="Arial" w:hAnsi="Arial" w:cs="Arial"/>
+          <w:lang w:val="en-ID"/>
+        </w:rPr>
+        <w:t xml:space="preserve"> later visits. Tag: Effectiveness 30/35</w:t>
       </w:r>
     </w:p>
     <w:p>
@@ -8371,7 +9241,35 @@
         <w:rPr>
           <w:rFonts w:ascii="Arial" w:eastAsia="DengXian" w:hAnsi="Arial" w:cs="Arial"/>
         </w:rPr>
-        <w:t>The proposed solution is an Offline Ranger Prioritization &amp; Support App designed to support the weed management and environmental monitoring activities carried out by Lama Lama Rangers (Yintjingga Aboriginal Corporation, n.d.-a). The app is not intended to replace their knowledge or create a separate weed management process. Instead, it brings infestation records, treatment information and follow-up activities into one workflow. The main goal is to make field records easier to access and help Rangers decide which locations need attention next, particularly when working across remote areas with unreliable internet access.</w:t>
+        <w:t xml:space="preserve">The proposed solution is an Offline Ranger Prioritization &amp; Support App designed to support the weed management and environmental monitoring activities carried out by Lama </w:t>
+      </w:r>
+      <w:proofErr w:type="spellStart"/>
+      <w:r>
+        <w:rPr>
+          <w:rFonts w:ascii="Arial" w:eastAsia="DengXian" w:hAnsi="Arial" w:cs="Arial"/>
+        </w:rPr>
+        <w:t>Lama</w:t>
+      </w:r>
+      <w:proofErr w:type="spellEnd"/>
+      <w:r>
+        <w:rPr>
+          <w:rFonts w:ascii="Arial" w:eastAsia="DengXian" w:hAnsi="Arial" w:cs="Arial"/>
+        </w:rPr>
+        <w:t xml:space="preserve"> Rangers (</w:t>
+      </w:r>
+      <w:proofErr w:type="spellStart"/>
+      <w:r>
+        <w:rPr>
+          <w:rFonts w:ascii="Arial" w:eastAsia="DengXian" w:hAnsi="Arial" w:cs="Arial"/>
+        </w:rPr>
+        <w:t>Yintjingga</w:t>
+      </w:r>
+      <w:proofErr w:type="spellEnd"/>
+      <w:r>
+        <w:rPr>
+          <w:rFonts w:ascii="Arial" w:eastAsia="DengXian" w:hAnsi="Arial" w:cs="Arial"/>
+        </w:rPr>
+        <w:t xml:space="preserve"> Aboriginal Corporation, n.d.-a). The app is not intended to replace their knowledge or create a separate weed management process. Instead, it brings infestation records, treatment information and follow-up activities into one workflow. The main goal is to make field records easier to access and help Rangers decide which locations need attention next, particularly when working across remote areas with unreliable internet access.</w:t>
       </w:r>
     </w:p>
     <w:p>
@@ -8442,7 +9340,35 @@
         <w:rPr>
           <w:rFonts w:ascii="Arial" w:eastAsia="DengXian" w:hAnsi="Arial" w:cs="Arial"/>
         </w:rPr>
-        <w:t>The process begins when a Ranger identifies a weed infestation during fieldwork. Using the app, the Ranger would create a site record containing a photograph, GPS location and weed species. The species could be selected from a fixed list based on the existing six-species Weed Action Plan (Yintjingga Aboriginal Corporation, n.d.-b). The Ranger could also enter the treatment date and describe the action taken. Keeping these details together means that the same record can be updated during later visits, rather than treating each observation as a separate entry.</w:t>
+        <w:t xml:space="preserve">The process begins when a Ranger identifies a weed infestation during fieldwork. Using the app, </w:t>
+      </w:r>
+      <w:proofErr w:type="gramStart"/>
+      <w:r>
+        <w:rPr>
+          <w:rFonts w:ascii="Arial" w:eastAsia="DengXian" w:hAnsi="Arial" w:cs="Arial"/>
+        </w:rPr>
+        <w:t>the Ranger</w:t>
+      </w:r>
+      <w:proofErr w:type="gramEnd"/>
+      <w:r>
+        <w:rPr>
+          <w:rFonts w:ascii="Arial" w:eastAsia="DengXian" w:hAnsi="Arial" w:cs="Arial"/>
+        </w:rPr>
+        <w:t xml:space="preserve"> would create a site record containing a photograph, GPS location and weed species. The species could be selected from a fixed list based on the existing six-species Weed Action Plan (</w:t>
+      </w:r>
+      <w:proofErr w:type="spellStart"/>
+      <w:r>
+        <w:rPr>
+          <w:rFonts w:ascii="Arial" w:eastAsia="DengXian" w:hAnsi="Arial" w:cs="Arial"/>
+        </w:rPr>
+        <w:t>Yintjingga</w:t>
+      </w:r>
+      <w:proofErr w:type="spellEnd"/>
+      <w:r>
+        <w:rPr>
+          <w:rFonts w:ascii="Arial" w:eastAsia="DengXian" w:hAnsi="Arial" w:cs="Arial"/>
+        </w:rPr>
+        <w:t xml:space="preserve"> Aboriginal Corporation, n.d.-b). The Ranger could also enter the treatment date and describe the action taken. Keeping these details together means that the same record can be updated during later visits, rather than treating each observation as a separate entry.</w:t>
       </w:r>
     </w:p>
     <w:p>
@@ -8469,7 +9395,23 @@
           <w:rFonts w:ascii="Arial" w:eastAsia="Malgun Gothic" w:hAnsi="Arial" w:cs="Arial"/>
           <w:lang w:eastAsia="ko-KR"/>
         </w:rPr>
-        <w:t>This table summarises the main steps of the proposed application, from recording weed infestations to follow-up monitoring.</w:t>
+        <w:t xml:space="preserve">This table </w:t>
+      </w:r>
+      <w:proofErr w:type="spellStart"/>
+      <w:r>
+        <w:rPr>
+          <w:rFonts w:ascii="Arial" w:eastAsia="Malgun Gothic" w:hAnsi="Arial" w:cs="Arial"/>
+          <w:lang w:eastAsia="ko-KR"/>
+        </w:rPr>
+        <w:t>summarises</w:t>
+      </w:r>
+      <w:proofErr w:type="spellEnd"/>
+      <w:r>
+        <w:rPr>
+          <w:rFonts w:ascii="Arial" w:eastAsia="Malgun Gothic" w:hAnsi="Arial" w:cs="Arial"/>
+          <w:lang w:eastAsia="ko-KR"/>
+        </w:rPr>
+        <w:t xml:space="preserve"> the main steps of the proposed application, from recording weed infestations to follow-up monitoring.</w:t>
       </w:r>
     </w:p>
     <w:p>
@@ -8844,8 +9786,17 @@
                 <w:rFonts w:ascii="Arial" w:eastAsia="Malgun Gothic" w:hAnsi="Arial" w:cs="Arial"/>
                 <w:lang w:eastAsia="ko-KR"/>
               </w:rPr>
-              <w:t>Data synchronisation</w:t>
-            </w:r>
+              <w:t xml:space="preserve">Data </w:t>
+            </w:r>
+            <w:proofErr w:type="spellStart"/>
+            <w:r>
+              <w:rPr>
+                <w:rFonts w:ascii="Arial" w:eastAsia="Malgun Gothic" w:hAnsi="Arial" w:cs="Arial"/>
+                <w:lang w:eastAsia="ko-KR"/>
+              </w:rPr>
+              <w:t>synchronisation</w:t>
+            </w:r>
+            <w:proofErr w:type="spellEnd"/>
           </w:p>
         </w:tc>
         <w:tc>
@@ -8867,12 +9818,21 @@
                 <w:lang w:eastAsia="ko-KR"/>
               </w:rPr>
             </w:pPr>
+            <w:proofErr w:type="spellStart"/>
             <w:r>
               <w:rPr>
                 <w:rFonts w:ascii="Arial" w:eastAsia="Malgun Gothic" w:hAnsi="Arial" w:cs="Arial"/>
                 <w:lang w:eastAsia="ko-KR"/>
               </w:rPr>
-              <w:t>Synchronise saved records when connectivity becomes available.</w:t>
+              <w:t>Synchronise</w:t>
+            </w:r>
+            <w:proofErr w:type="spellEnd"/>
+            <w:r>
+              <w:rPr>
+                <w:rFonts w:ascii="Arial" w:eastAsia="Malgun Gothic" w:hAnsi="Arial" w:cs="Arial"/>
+                <w:lang w:eastAsia="ko-KR"/>
+              </w:rPr>
+              <w:t xml:space="preserve"> saved records when connectivity becomes available.</w:t>
             </w:r>
           </w:p>
         </w:tc>
@@ -8926,6 +9886,7 @@
                 <w:lang w:eastAsia="ko-KR"/>
               </w:rPr>
             </w:pPr>
+            <w:proofErr w:type="spellStart"/>
             <w:r>
               <w:rPr>
                 <w:rFonts w:ascii="Arial" w:eastAsia="Malgun Gothic" w:hAnsi="Arial" w:cs="Arial"/>
@@ -8933,6 +9894,7 @@
               </w:rPr>
               <w:t>Prioritisation</w:t>
             </w:r>
+            <w:proofErr w:type="spellEnd"/>
           </w:p>
         </w:tc>
         <w:tc>
@@ -9082,7 +10044,35 @@
         <w:rPr>
           <w:rFonts w:ascii="Arial" w:eastAsia="DengXian" w:hAnsi="Arial" w:cs="Arial"/>
         </w:rPr>
-        <w:t>After a new site is recorded, its information would appear in a prioritisation dashboard. The dashboard is proposed to show infestation locations, treatment status and sites requiring follow-up. However, the app should support Ranger judgement, not make final treatment decisions automatically. Priority rules would need to be agreed with the Ranger team before implementation.</w:t>
+        <w:t xml:space="preserve">After a new site is recorded, its information </w:t>
+      </w:r>
+      <w:proofErr w:type="gramStart"/>
+      <w:r>
+        <w:rPr>
+          <w:rFonts w:ascii="Arial" w:eastAsia="DengXian" w:hAnsi="Arial" w:cs="Arial"/>
+        </w:rPr>
+        <w:t>would</w:t>
+      </w:r>
+      <w:proofErr w:type="gramEnd"/>
+      <w:r>
+        <w:rPr>
+          <w:rFonts w:ascii="Arial" w:eastAsia="DengXian" w:hAnsi="Arial" w:cs="Arial"/>
+        </w:rPr>
+        <w:t xml:space="preserve"> appear in a </w:t>
+      </w:r>
+      <w:proofErr w:type="spellStart"/>
+      <w:r>
+        <w:rPr>
+          <w:rFonts w:ascii="Arial" w:eastAsia="DengXian" w:hAnsi="Arial" w:cs="Arial"/>
+        </w:rPr>
+        <w:t>prioritisation</w:t>
+      </w:r>
+      <w:proofErr w:type="spellEnd"/>
+      <w:r>
+        <w:rPr>
+          <w:rFonts w:ascii="Arial" w:eastAsia="DengXian" w:hAnsi="Arial" w:cs="Arial"/>
+        </w:rPr>
+        <w:t xml:space="preserve"> dashboard. The dashboard is proposed to show infestation locations, treatment status and sites requiring follow-up. However, the app should support Ranger judgement, not make final treatment decisions automatically. Priority rules would need to be agreed with the Ranger team before implementation.</w:t>
       </w:r>
     </w:p>
     <w:p>
@@ -9193,7 +10183,61 @@
           <w:szCs w:val="22"/>
           <w:lang w:val="en-ID"/>
         </w:rPr>
-        <w:t>This application integrates Supabase as the backend and database provider for storing infestation records, treatment histories, and photographs. Supabase’s Pro plan starts from A$40/month (around A$480 annually), liable to exchange rates and additional usage charges (Supabase, n.d.).</w:t>
+        <w:t xml:space="preserve">This application integrates </w:t>
+      </w:r>
+      <w:proofErr w:type="spellStart"/>
+      <w:r>
+        <w:rPr>
+          <w:rFonts w:ascii="Arial" w:hAnsi="Arial" w:cs="Arial"/>
+          <w:szCs w:val="22"/>
+          <w:lang w:val="en-ID"/>
+        </w:rPr>
+        <w:t>Supabase</w:t>
+      </w:r>
+      <w:proofErr w:type="spellEnd"/>
+      <w:r>
+        <w:rPr>
+          <w:rFonts w:ascii="Arial" w:hAnsi="Arial" w:cs="Arial"/>
+          <w:szCs w:val="22"/>
+          <w:lang w:val="en-ID"/>
+        </w:rPr>
+        <w:t xml:space="preserve"> as the backend and database provider for storing infestation records, treatment histories, and photographs. </w:t>
+      </w:r>
+      <w:proofErr w:type="spellStart"/>
+      <w:r>
+        <w:rPr>
+          <w:rFonts w:ascii="Arial" w:hAnsi="Arial" w:cs="Arial"/>
+          <w:szCs w:val="22"/>
+          <w:lang w:val="en-ID"/>
+        </w:rPr>
+        <w:t>Supabase’s</w:t>
+      </w:r>
+      <w:proofErr w:type="spellEnd"/>
+      <w:r>
+        <w:rPr>
+          <w:rFonts w:ascii="Arial" w:hAnsi="Arial" w:cs="Arial"/>
+          <w:szCs w:val="22"/>
+          <w:lang w:val="en-ID"/>
+        </w:rPr>
+        <w:t xml:space="preserve"> Pro plan starts from A$40/month (around A$480 annually), liable to exchange rates and additional usage charges (</w:t>
+      </w:r>
+      <w:proofErr w:type="spellStart"/>
+      <w:r>
+        <w:rPr>
+          <w:rFonts w:ascii="Arial" w:hAnsi="Arial" w:cs="Arial"/>
+          <w:szCs w:val="22"/>
+          <w:lang w:val="en-ID"/>
+        </w:rPr>
+        <w:t>Supabase</w:t>
+      </w:r>
+      <w:proofErr w:type="spellEnd"/>
+      <w:r>
+        <w:rPr>
+          <w:rFonts w:ascii="Arial" w:hAnsi="Arial" w:cs="Arial"/>
+          <w:szCs w:val="22"/>
+          <w:lang w:val="en-ID"/>
+        </w:rPr>
+        <w:t>, n.d.).</w:t>
       </w:r>
       <w:r>
         <w:rPr>
@@ -9267,7 +10311,21 @@
         <w:rPr>
           <w:rFonts w:ascii="Arial" w:eastAsia="DengXian" w:hAnsi="Arial" w:cs="Arial"/>
         </w:rPr>
-        <w:t xml:space="preserve">The proposed application aims to complement existing field data practices, including the I-Tracker tools previously used by Lama Lama Rangers (NESP Resilient Landscapes Hub, 2014). However, direct integration with I-Tracker has not yet been confirmed and would require further investigation. </w:t>
+        <w:t xml:space="preserve">The proposed application aims to complement existing field data practices, including the I-Tracker tools previously used by Lama </w:t>
+      </w:r>
+      <w:proofErr w:type="spellStart"/>
+      <w:r>
+        <w:rPr>
+          <w:rFonts w:ascii="Arial" w:eastAsia="DengXian" w:hAnsi="Arial" w:cs="Arial"/>
+        </w:rPr>
+        <w:t>Lama</w:t>
+      </w:r>
+      <w:proofErr w:type="spellEnd"/>
+      <w:r>
+        <w:rPr>
+          <w:rFonts w:ascii="Arial" w:eastAsia="DengXian" w:hAnsi="Arial" w:cs="Arial"/>
+        </w:rPr>
+        <w:t xml:space="preserve"> Rangers (NESP Resilient Landscapes Hub, 2014). However, direct integration with I-Tracker has not yet been confirmed and would require further investigation. </w:t>
       </w:r>
     </w:p>
     <w:p>
@@ -9435,7 +10493,23 @@
           <w:rFonts w:ascii="Arial" w:hAnsi="Arial" w:cs="Arial"/>
           <w:lang w:val="en-ID"/>
         </w:rPr>
-        <w:t>A working cross-platform prototype that can be opened in a browser or on a phone, built by the team using a hosted database (Supabase) and OpenStreetMap maps.</w:t>
+        <w:t>A working cross-platform prototype that can be opened in a browser or on a phone, built by the team using a hosted database (</w:t>
+      </w:r>
+      <w:proofErr w:type="spellStart"/>
+      <w:r>
+        <w:rPr>
+          <w:rFonts w:ascii="Arial" w:hAnsi="Arial" w:cs="Arial"/>
+          <w:lang w:val="en-ID"/>
+        </w:rPr>
+        <w:t>Supabase</w:t>
+      </w:r>
+      <w:proofErr w:type="spellEnd"/>
+      <w:r>
+        <w:rPr>
+          <w:rFonts w:ascii="Arial" w:hAnsi="Arial" w:cs="Arial"/>
+          <w:lang w:val="en-ID"/>
+        </w:rPr>
+        <w:t>) and OpenStreetMap maps.</w:t>
       </w:r>
     </w:p>
     <w:p>
@@ -10206,7 +11280,25 @@
           <w:szCs w:val="22"/>
           <w:lang w:val="en-ID"/>
         </w:rPr>
-        <w:t xml:space="preserve">Lama Lama Rangers already record field data digitally with Fulcrum and I-Tracker (Engineers Without Borders Australia, 2026b; NESP Resilient Landscapes Hub, 2014), </w:t>
+        <w:t xml:space="preserve">Lama </w:t>
+      </w:r>
+      <w:proofErr w:type="spellStart"/>
+      <w:r>
+        <w:rPr>
+          <w:rFonts w:ascii="Arial" w:hAnsi="Arial" w:cs="Arial"/>
+          <w:szCs w:val="22"/>
+          <w:lang w:val="en-ID"/>
+        </w:rPr>
+        <w:t>Lama</w:t>
+      </w:r>
+      <w:proofErr w:type="spellEnd"/>
+      <w:r>
+        <w:rPr>
+          <w:rFonts w:ascii="Arial" w:hAnsi="Arial" w:cs="Arial"/>
+          <w:szCs w:val="22"/>
+          <w:lang w:val="en-ID"/>
+        </w:rPr>
+        <w:t xml:space="preserve"> Rangers already record field data digitally with Fulcrum and I-Tracker (Engineers Without Borders Australia, 2026b; NESP Resilient Landscapes Hub, 2014), </w:t>
       </w:r>
       <w:r>
         <w:rPr>
@@ -11050,13 +12142,23 @@
                 <w:lang w:val="en-ID"/>
               </w:rPr>
             </w:pPr>
+            <w:proofErr w:type="spellStart"/>
             <w:r>
               <w:rPr>
                 <w:rFonts w:ascii="Arial" w:hAnsi="Arial" w:cs="Arial"/>
                 <w:szCs w:val="22"/>
                 <w:lang w:val="en-ID"/>
               </w:rPr>
-              <w:t>Supabase backend and security</w:t>
+              <w:t>Supabase</w:t>
+            </w:r>
+            <w:proofErr w:type="spellEnd"/>
+            <w:r>
+              <w:rPr>
+                <w:rFonts w:ascii="Arial" w:hAnsi="Arial" w:cs="Arial"/>
+                <w:szCs w:val="22"/>
+                <w:lang w:val="en-ID"/>
+              </w:rPr>
+              <w:t xml:space="preserve"> backend and security</w:t>
             </w:r>
           </w:p>
         </w:tc>
@@ -11892,13 +12994,23 @@
                 <w:lang w:val="en-ID"/>
               </w:rPr>
             </w:pPr>
+            <w:proofErr w:type="spellStart"/>
             <w:r>
               <w:rPr>
                 <w:rFonts w:ascii="Arial" w:hAnsi="Arial" w:cs="Arial"/>
                 <w:szCs w:val="22"/>
                 <w:lang w:val="en-ID"/>
               </w:rPr>
-              <w:t>Supabase subscription</w:t>
+              <w:t>Supabase</w:t>
+            </w:r>
+            <w:proofErr w:type="spellEnd"/>
+            <w:r>
+              <w:rPr>
+                <w:rFonts w:ascii="Arial" w:hAnsi="Arial" w:cs="Arial"/>
+                <w:szCs w:val="22"/>
+                <w:lang w:val="en-ID"/>
+              </w:rPr>
+              <w:t xml:space="preserve"> subscription</w:t>
             </w:r>
           </w:p>
         </w:tc>
@@ -12197,7 +13309,31 @@
           <w:szCs w:val="20"/>
           <w:lang w:val="en-ID"/>
         </w:rPr>
-        <w:t>Note. Development hours estimated with ChatGPT (OpenAI, 2026). Hourly rate from Second Talent (2026); database pricing from Supabase (n.d.), US$25 a month converted to about A$40; app distribution fee from Apple (n.d.).</w:t>
+        <w:t xml:space="preserve">Note. Development hours estimated with ChatGPT (OpenAI, 2026). Hourly rate from Second Talent (2026); database pricing from </w:t>
+      </w:r>
+      <w:proofErr w:type="spellStart"/>
+      <w:r>
+        <w:rPr>
+          <w:rFonts w:ascii="Arial" w:hAnsi="Arial" w:cs="Arial"/>
+          <w:i/>
+          <w:iCs/>
+          <w:sz w:val="20"/>
+          <w:szCs w:val="20"/>
+          <w:lang w:val="en-ID"/>
+        </w:rPr>
+        <w:t>Supabase</w:t>
+      </w:r>
+      <w:proofErr w:type="spellEnd"/>
+      <w:r>
+        <w:rPr>
+          <w:rFonts w:ascii="Arial" w:hAnsi="Arial" w:cs="Arial"/>
+          <w:i/>
+          <w:iCs/>
+          <w:sz w:val="20"/>
+          <w:szCs w:val="20"/>
+          <w:lang w:val="en-ID"/>
+        </w:rPr>
+        <w:t xml:space="preserve"> (n.d.), US$25 a month converted to about A$40; app distribution fee from Apple (n.d.).</w:t>
       </w:r>
     </w:p>
     <w:p>
@@ -12275,13 +13411,37 @@
           <w:rFonts w:ascii="Arial" w:hAnsi="Arial" w:cs="Arial"/>
           <w:lang w:val="en-ID"/>
         </w:rPr>
-        <w:t>The Lama Lama Rangers play an important role in protecting Country through weed management, wildlife conservation, and environmental monitoring (</w:t>
-      </w:r>
-      <w:r>
-        <w:rPr>
-          <w:rFonts w:ascii="Arial" w:hAnsi="Arial" w:cs="Arial"/>
-        </w:rPr>
-        <w:t>Yintjingga Aboriginal Corporation, n.d.-a</w:t>
+        <w:t xml:space="preserve">The Lama </w:t>
+      </w:r>
+      <w:proofErr w:type="spellStart"/>
+      <w:r>
+        <w:rPr>
+          <w:rFonts w:ascii="Arial" w:hAnsi="Arial" w:cs="Arial"/>
+          <w:lang w:val="en-ID"/>
+        </w:rPr>
+        <w:t>Lama</w:t>
+      </w:r>
+      <w:proofErr w:type="spellEnd"/>
+      <w:r>
+        <w:rPr>
+          <w:rFonts w:ascii="Arial" w:hAnsi="Arial" w:cs="Arial"/>
+          <w:lang w:val="en-ID"/>
+        </w:rPr>
+        <w:t xml:space="preserve"> Rangers play an important role in protecting Country through weed management, wildlife conservation, and environmental monitoring (</w:t>
+      </w:r>
+      <w:proofErr w:type="spellStart"/>
+      <w:r>
+        <w:rPr>
+          <w:rFonts w:ascii="Arial" w:hAnsi="Arial" w:cs="Arial"/>
+        </w:rPr>
+        <w:t>Yintjingga</w:t>
+      </w:r>
+      <w:proofErr w:type="spellEnd"/>
+      <w:r>
+        <w:rPr>
+          <w:rFonts w:ascii="Arial" w:hAnsi="Arial" w:cs="Arial"/>
+        </w:rPr>
+        <w:t xml:space="preserve"> Aboriginal Corporation, n.d.-a</w:t>
       </w:r>
       <w:r>
         <w:rPr>
@@ -12414,12 +13574,21 @@
           <w:lang w:val="en-ID"/>
         </w:rPr>
       </w:pPr>
-      <w:r>
-        <w:rPr>
-          <w:rFonts w:ascii="Arial" w:hAnsi="Arial" w:cs="Arial"/>
-          <w:lang w:val="en-ID"/>
-        </w:rPr>
-        <w:t>Yintjingga and the rangers agree, and write down, how records will and will not be used.</w:t>
+      <w:proofErr w:type="spellStart"/>
+      <w:r>
+        <w:rPr>
+          <w:rFonts w:ascii="Arial" w:hAnsi="Arial" w:cs="Arial"/>
+          <w:lang w:val="en-ID"/>
+        </w:rPr>
+        <w:t>Yintjingga</w:t>
+      </w:r>
+      <w:proofErr w:type="spellEnd"/>
+      <w:r>
+        <w:rPr>
+          <w:rFonts w:ascii="Arial" w:hAnsi="Arial" w:cs="Arial"/>
+          <w:lang w:val="en-ID"/>
+        </w:rPr>
+        <w:t xml:space="preserve"> and the rangers agree, and write down, how records will and will not be used.</w:t>
       </w:r>
     </w:p>
     <w:p>
@@ -12546,12 +13715,21 @@
           <w:lang w:val="en-ID"/>
         </w:rPr>
       </w:pPr>
-      <w:r>
-        <w:rPr>
-          <w:rFonts w:ascii="Arial" w:hAnsi="Arial" w:cs="Arial"/>
-          <w:lang w:val="en-ID"/>
-        </w:rPr>
-        <w:t>Yintjingga holds the database account and decides who can see, use and share the data, in line with Indigenous data sovereignty principles.</w:t>
+      <w:proofErr w:type="spellStart"/>
+      <w:r>
+        <w:rPr>
+          <w:rFonts w:ascii="Arial" w:hAnsi="Arial" w:cs="Arial"/>
+          <w:lang w:val="en-ID"/>
+        </w:rPr>
+        <w:t>Yintjingga</w:t>
+      </w:r>
+      <w:proofErr w:type="spellEnd"/>
+      <w:r>
+        <w:rPr>
+          <w:rFonts w:ascii="Arial" w:hAnsi="Arial" w:cs="Arial"/>
+          <w:lang w:val="en-ID"/>
+        </w:rPr>
+        <w:t xml:space="preserve"> holds the database account and decides who can see, use and share the data, in line with Indigenous data sovereignty principles.</w:t>
       </w:r>
     </w:p>
     <w:p>
@@ -12902,12 +14080,21 @@
         </w:rPr>
         <w:t xml:space="preserve">Risk: </w:t>
       </w:r>
-      <w:r>
-        <w:rPr>
-          <w:rFonts w:ascii="Arial" w:hAnsi="Arial" w:cs="Arial"/>
-          <w:lang w:val="en-ID"/>
-        </w:rPr>
-        <w:t>Supabase subscription must be renewed over a certain period, without a clear delegation application may not work.</w:t>
+      <w:proofErr w:type="spellStart"/>
+      <w:r>
+        <w:rPr>
+          <w:rFonts w:ascii="Arial" w:hAnsi="Arial" w:cs="Arial"/>
+          <w:lang w:val="en-ID"/>
+        </w:rPr>
+        <w:t>Supabase</w:t>
+      </w:r>
+      <w:proofErr w:type="spellEnd"/>
+      <w:r>
+        <w:rPr>
+          <w:rFonts w:ascii="Arial" w:hAnsi="Arial" w:cs="Arial"/>
+          <w:lang w:val="en-ID"/>
+        </w:rPr>
+        <w:t xml:space="preserve"> subscription must be renewed over a certain period, without a clear delegation application may not work.</w:t>
       </w:r>
     </w:p>
     <w:p>
@@ -13368,7 +14555,23 @@
           <w:rFonts w:ascii="Arial" w:hAnsi="Arial" w:cs="Arial"/>
           <w:lang w:val="en-ID"/>
         </w:rPr>
-        <w:t xml:space="preserve"> works well, however, it can be improved by integrating some extensive technologies. </w:t>
+        <w:t xml:space="preserve"> works </w:t>
+      </w:r>
+      <w:proofErr w:type="gramStart"/>
+      <w:r>
+        <w:rPr>
+          <w:rFonts w:ascii="Arial" w:hAnsi="Arial" w:cs="Arial"/>
+          <w:lang w:val="en-ID"/>
+        </w:rPr>
+        <w:t>well,</w:t>
+      </w:r>
+      <w:proofErr w:type="gramEnd"/>
+      <w:r>
+        <w:rPr>
+          <w:rFonts w:ascii="Arial" w:hAnsi="Arial" w:cs="Arial"/>
+          <w:lang w:val="en-ID"/>
+        </w:rPr>
+        <w:t xml:space="preserve"> however, it can be improved by integrating some extensive technologies. </w:t>
       </w:r>
     </w:p>
     <w:p>
@@ -13486,7 +14689,25 @@
           <w:szCs w:val="20"/>
           <w:lang w:val="en-ID"/>
         </w:rPr>
+        <w:t>[</w:t>
+      </w:r>
+      <w:r>
+        <w:rPr>
+          <w:rFonts w:ascii="Arial" w:hAnsi="Arial" w:cs="Arial"/>
+          <w:sz w:val="20"/>
+          <w:szCs w:val="20"/>
+          <w:lang w:val="en-ID"/>
+        </w:rPr>
         <w:t>Artificial intelligence concept image</w:t>
+      </w:r>
+      <w:r>
+        <w:rPr>
+          <w:rFonts w:ascii="Arial" w:hAnsi="Arial" w:cs="Arial"/>
+          <w:sz w:val="20"/>
+          <w:szCs w:val="20"/>
+          <w:lang w:val="en-ID"/>
+        </w:rPr>
+        <w:t>]</w:t>
       </w:r>
     </w:p>
     <w:p>
@@ -13770,7 +14991,33 @@
           <w:lang w:val="en-ID"/>
         </w:rPr>
         <w:br/>
+      </w:r>
+      <w:r>
+        <w:rPr>
+          <w:rFonts w:ascii="Arial" w:hAnsi="Arial" w:cs="Arial"/>
+          <w:sz w:val="20"/>
+          <w:szCs w:val="20"/>
+          <w:lang w:val="en-ID"/>
+        </w:rPr>
+        <w:t>[</w:t>
+      </w:r>
+      <w:r>
+        <w:rPr>
+          <w:rFonts w:ascii="Arial" w:hAnsi="Arial" w:cs="Arial"/>
+          <w:sz w:val="20"/>
+          <w:szCs w:val="20"/>
+          <w:lang w:val="en-ID"/>
+        </w:rPr>
         <w:t>Network Illustration</w:t>
+      </w:r>
+      <w:r>
+        <w:rPr>
+          <w:rFonts w:ascii="Arial" w:hAnsi="Arial" w:cs="Arial"/>
+          <w:sz w:val="20"/>
+          <w:szCs w:val="20"/>
+          <w:lang w:val="en-ID"/>
+        </w:rPr>
+        <w:t>]</w:t>
       </w:r>
     </w:p>
     <w:p>
@@ -13791,7 +15038,27 @@
           <w:szCs w:val="20"/>
           <w:lang w:val="en-ID"/>
         </w:rPr>
-        <w:t>(Coeo Solutions, n.d.)</w:t>
+        <w:t>(</w:t>
+      </w:r>
+      <w:proofErr w:type="spellStart"/>
+      <w:r>
+        <w:rPr>
+          <w:rFonts w:ascii="Arial" w:hAnsi="Arial" w:cs="Arial"/>
+          <w:sz w:val="20"/>
+          <w:szCs w:val="20"/>
+          <w:lang w:val="en-ID"/>
+        </w:rPr>
+        <w:t>Coeo</w:t>
+      </w:r>
+      <w:proofErr w:type="spellEnd"/>
+      <w:r>
+        <w:rPr>
+          <w:rFonts w:ascii="Arial" w:hAnsi="Arial" w:cs="Arial"/>
+          <w:sz w:val="20"/>
+          <w:szCs w:val="20"/>
+          <w:lang w:val="en-ID"/>
+        </w:rPr>
+        <w:t xml:space="preserve"> Solutions, n.d.)</w:t>
       </w:r>
     </w:p>
     <w:p>
@@ -13916,7 +15183,25 @@
           <w:szCs w:val="20"/>
           <w:lang w:val="en-ID"/>
         </w:rPr>
+        <w:t>[</w:t>
+      </w:r>
+      <w:r>
+        <w:rPr>
+          <w:rFonts w:ascii="Arial" w:hAnsi="Arial" w:cs="Arial"/>
+          <w:sz w:val="20"/>
+          <w:szCs w:val="20"/>
+          <w:lang w:val="en-ID"/>
+        </w:rPr>
         <w:t>DJI Air 3 drone</w:t>
+      </w:r>
+      <w:r>
+        <w:rPr>
+          <w:rFonts w:ascii="Arial" w:hAnsi="Arial" w:cs="Arial"/>
+          <w:sz w:val="20"/>
+          <w:szCs w:val="20"/>
+          <w:lang w:val="en-ID"/>
+        </w:rPr>
+        <w:t>]</w:t>
       </w:r>
     </w:p>
     <w:p>
@@ -14092,7 +15377,23 @@
           <w:rFonts w:ascii="Arial" w:hAnsi="Arial" w:cs="Arial"/>
           <w:lang w:val="en-AU"/>
         </w:rPr>
-        <w:t xml:space="preserve">Centralized web analytics for Yintjingga </w:t>
+        <w:t xml:space="preserve">Centralized web analytics for </w:t>
+      </w:r>
+      <w:proofErr w:type="spellStart"/>
+      <w:r>
+        <w:rPr>
+          <w:rFonts w:ascii="Arial" w:hAnsi="Arial" w:cs="Arial"/>
+          <w:lang w:val="en-AU"/>
+        </w:rPr>
+        <w:t>Yintjingga</w:t>
+      </w:r>
+      <w:proofErr w:type="spellEnd"/>
+      <w:r>
+        <w:rPr>
+          <w:rFonts w:ascii="Arial" w:hAnsi="Arial" w:cs="Arial"/>
+          <w:lang w:val="en-AU"/>
+        </w:rPr>
+        <w:t xml:space="preserve"> </w:t>
       </w:r>
       <w:r>
         <w:rPr>
@@ -14161,7 +15462,25 @@
           <w:szCs w:val="20"/>
           <w:lang w:val="en-ID"/>
         </w:rPr>
+        <w:t>[</w:t>
+      </w:r>
+      <w:r>
+        <w:rPr>
+          <w:rFonts w:ascii="Arial" w:hAnsi="Arial" w:cs="Arial"/>
+          <w:sz w:val="20"/>
+          <w:szCs w:val="20"/>
+          <w:lang w:val="en-ID"/>
+        </w:rPr>
         <w:t>Executive Dashboard Illustration</w:t>
+      </w:r>
+      <w:r>
+        <w:rPr>
+          <w:rFonts w:ascii="Arial" w:hAnsi="Arial" w:cs="Arial"/>
+          <w:sz w:val="20"/>
+          <w:szCs w:val="20"/>
+          <w:lang w:val="en-ID"/>
+        </w:rPr>
+        <w:t>]</w:t>
       </w:r>
     </w:p>
     <w:p>
@@ -14533,12 +15852,21 @@
           <w:lang w:val="en-ID"/>
         </w:rPr>
       </w:pPr>
-      <w:r>
-        <w:rPr>
-          <w:rFonts w:ascii="Arial" w:hAnsi="Arial" w:cs="Arial"/>
-          <w:lang w:val="en-ID"/>
-        </w:rPr>
-        <w:t xml:space="preserve">Coeo Solutions. (n.d.). [Network and connectivity issues] [Image]. </w:t>
+      <w:proofErr w:type="spellStart"/>
+      <w:r>
+        <w:rPr>
+          <w:rFonts w:ascii="Arial" w:hAnsi="Arial" w:cs="Arial"/>
+          <w:lang w:val="en-ID"/>
+        </w:rPr>
+        <w:t>Coeo</w:t>
+      </w:r>
+      <w:proofErr w:type="spellEnd"/>
+      <w:r>
+        <w:rPr>
+          <w:rFonts w:ascii="Arial" w:hAnsi="Arial" w:cs="Arial"/>
+          <w:lang w:val="en-ID"/>
+        </w:rPr>
+        <w:t xml:space="preserve"> Solutions. (n.d.). [Network and connectivity issues] [Image]. </w:t>
       </w:r>
       <w:hyperlink r:id="rId21" w:history="1">
         <w:r>
@@ -14819,7 +16147,23 @@
           <w:rFonts w:ascii="Arial" w:hAnsi="Arial" w:cs="Arial"/>
           <w:lang w:val="en-ID"/>
         </w:rPr>
-        <w:t xml:space="preserve">NESP Resilient Landscapes Hub. (2014, December 10). Monitoring Lama Lama wetlands. </w:t>
+        <w:t xml:space="preserve">NESP Resilient Landscapes Hub. (2014, December 10). Monitoring Lama </w:t>
+      </w:r>
+      <w:proofErr w:type="spellStart"/>
+      <w:r>
+        <w:rPr>
+          <w:rFonts w:ascii="Arial" w:hAnsi="Arial" w:cs="Arial"/>
+          <w:lang w:val="en-ID"/>
+        </w:rPr>
+        <w:t>Lama</w:t>
+      </w:r>
+      <w:proofErr w:type="spellEnd"/>
+      <w:r>
+        <w:rPr>
+          <w:rFonts w:ascii="Arial" w:hAnsi="Arial" w:cs="Arial"/>
+          <w:lang w:val="en-ID"/>
+        </w:rPr>
+        <w:t xml:space="preserve"> wetlands. </w:t>
       </w:r>
       <w:hyperlink r:id="rId28" w:history="1">
         <w:r>
@@ -14919,12 +16263,21 @@
           <w:lang w:val="en-ID"/>
         </w:rPr>
       </w:pPr>
-      <w:r>
-        <w:rPr>
-          <w:rFonts w:ascii="Arial" w:hAnsi="Arial" w:cs="Arial"/>
-          <w:lang w:val="en-ID"/>
-        </w:rPr>
-        <w:t xml:space="preserve">Supabase. (n.d.). Pricing &amp; fees. </w:t>
+      <w:proofErr w:type="spellStart"/>
+      <w:r>
+        <w:rPr>
+          <w:rFonts w:ascii="Arial" w:hAnsi="Arial" w:cs="Arial"/>
+          <w:lang w:val="en-ID"/>
+        </w:rPr>
+        <w:t>Supabase</w:t>
+      </w:r>
+      <w:proofErr w:type="spellEnd"/>
+      <w:r>
+        <w:rPr>
+          <w:rFonts w:ascii="Arial" w:hAnsi="Arial" w:cs="Arial"/>
+          <w:lang w:val="en-ID"/>
+        </w:rPr>
+        <w:t xml:space="preserve">. (n.d.). Pricing &amp; fees. </w:t>
       </w:r>
       <w:hyperlink r:id="rId31" w:history="1">
         <w:r>
@@ -14989,12 +16342,53 @@
           <w:lang w:val="en-ID"/>
         </w:rPr>
       </w:pPr>
-      <w:r>
-        <w:rPr>
-          <w:rFonts w:ascii="Arial" w:hAnsi="Arial" w:cs="Arial"/>
-          <w:lang w:val="en-ID"/>
-        </w:rPr>
-        <w:t xml:space="preserve">Yintjingga Aboriginal Corporation. (n.d.-a). Lama Lama rangers. Welcome to Lama Lama Country. </w:t>
+      <w:proofErr w:type="spellStart"/>
+      <w:r>
+        <w:rPr>
+          <w:rFonts w:ascii="Arial" w:hAnsi="Arial" w:cs="Arial"/>
+          <w:lang w:val="en-ID"/>
+        </w:rPr>
+        <w:t>Yintjingga</w:t>
+      </w:r>
+      <w:proofErr w:type="spellEnd"/>
+      <w:r>
+        <w:rPr>
+          <w:rFonts w:ascii="Arial" w:hAnsi="Arial" w:cs="Arial"/>
+          <w:lang w:val="en-ID"/>
+        </w:rPr>
+        <w:t xml:space="preserve"> Aboriginal Corporation. (n.d.-a). Lama </w:t>
+      </w:r>
+      <w:proofErr w:type="spellStart"/>
+      <w:r>
+        <w:rPr>
+          <w:rFonts w:ascii="Arial" w:hAnsi="Arial" w:cs="Arial"/>
+          <w:lang w:val="en-ID"/>
+        </w:rPr>
+        <w:t>Lama</w:t>
+      </w:r>
+      <w:proofErr w:type="spellEnd"/>
+      <w:r>
+        <w:rPr>
+          <w:rFonts w:ascii="Arial" w:hAnsi="Arial" w:cs="Arial"/>
+          <w:lang w:val="en-ID"/>
+        </w:rPr>
+        <w:t xml:space="preserve"> rangers. Welcome to Lama </w:t>
+      </w:r>
+      <w:proofErr w:type="spellStart"/>
+      <w:r>
+        <w:rPr>
+          <w:rFonts w:ascii="Arial" w:hAnsi="Arial" w:cs="Arial"/>
+          <w:lang w:val="en-ID"/>
+        </w:rPr>
+        <w:t>Lama</w:t>
+      </w:r>
+      <w:proofErr w:type="spellEnd"/>
+      <w:r>
+        <w:rPr>
+          <w:rFonts w:ascii="Arial" w:hAnsi="Arial" w:cs="Arial"/>
+          <w:lang w:val="en-ID"/>
+        </w:rPr>
+        <w:t xml:space="preserve"> Country. </w:t>
       </w:r>
       <w:hyperlink r:id="rId33" w:history="1">
         <w:r>
@@ -15024,13 +16418,38 @@
           <w:lang w:val="en-ID"/>
         </w:rPr>
       </w:pPr>
+      <w:proofErr w:type="spellStart"/>
       <w:r>
         <w:rPr>
           <w:rFonts w:ascii="Arial" w:hAnsi="Arial" w:cs="Arial"/>
           <w:lang w:val="en-ID"/>
         </w:rPr>
         <w:lastRenderedPageBreak/>
-        <w:t xml:space="preserve">Yintjingga Aboriginal Corporation. (n.d.-b). Weed monitoring. Welcome to Lama Lama Country. </w:t>
+        <w:t>Yintjingga</w:t>
+      </w:r>
+      <w:proofErr w:type="spellEnd"/>
+      <w:r>
+        <w:rPr>
+          <w:rFonts w:ascii="Arial" w:hAnsi="Arial" w:cs="Arial"/>
+          <w:lang w:val="en-ID"/>
+        </w:rPr>
+        <w:t xml:space="preserve"> Aboriginal Corporation. (n.d.-b). Weed monitoring. Welcome to Lama </w:t>
+      </w:r>
+      <w:proofErr w:type="spellStart"/>
+      <w:r>
+        <w:rPr>
+          <w:rFonts w:ascii="Arial" w:hAnsi="Arial" w:cs="Arial"/>
+          <w:lang w:val="en-ID"/>
+        </w:rPr>
+        <w:t>Lama</w:t>
+      </w:r>
+      <w:proofErr w:type="spellEnd"/>
+      <w:r>
+        <w:rPr>
+          <w:rFonts w:ascii="Arial" w:hAnsi="Arial" w:cs="Arial"/>
+          <w:lang w:val="en-ID"/>
+        </w:rPr>
+        <w:t xml:space="preserve"> Country. </w:t>
       </w:r>
       <w:hyperlink r:id="rId34" w:history="1">
         <w:r>
@@ -15395,8 +16814,23 @@
                 <w:lang w:val="en-ID"/>
                 <w14:ligatures w14:val="none"/>
               </w:rPr>
-              <w:t>Glenny Veneesha</w:t>
-            </w:r>
+              <w:t xml:space="preserve">Glenny </w:t>
+            </w:r>
+            <w:proofErr w:type="spellStart"/>
+            <w:r>
+              <w:rPr>
+                <w:rFonts w:ascii="Arial" w:eastAsia="Times New Roman" w:hAnsi="Arial" w:cs="Arial"/>
+                <w:b/>
+                <w:bCs/>
+                <w:color w:val="000000"/>
+                <w:kern w:val="0"/>
+                <w:szCs w:val="22"/>
+                <w:lang w:val="en-ID"/>
+                <w14:ligatures w14:val="none"/>
+              </w:rPr>
+              <w:t>Veneesha</w:t>
+            </w:r>
+            <w:proofErr w:type="spellEnd"/>
           </w:p>
         </w:tc>
         <w:tc>
@@ -15428,6 +16862,7 @@
                 <w14:ligatures w14:val="none"/>
               </w:rPr>
             </w:pPr>
+            <w:proofErr w:type="spellStart"/>
             <w:r>
               <w:rPr>
                 <w:rFonts w:ascii="Arial" w:eastAsia="Times New Roman" w:hAnsi="Arial" w:cs="Arial"/>
@@ -15439,7 +16874,21 @@
                 <w:lang w:val="en-ID"/>
                 <w14:ligatures w14:val="none"/>
               </w:rPr>
-              <w:t>Hangyeon Cho</w:t>
+              <w:t>Hangyeon</w:t>
+            </w:r>
+            <w:proofErr w:type="spellEnd"/>
+            <w:r>
+              <w:rPr>
+                <w:rFonts w:ascii="Arial" w:eastAsia="Times New Roman" w:hAnsi="Arial" w:cs="Arial"/>
+                <w:b/>
+                <w:bCs/>
+                <w:color w:val="000000"/>
+                <w:kern w:val="0"/>
+                <w:szCs w:val="22"/>
+                <w:lang w:val="en-ID"/>
+                <w14:ligatures w14:val="none"/>
+              </w:rPr>
+              <w:t xml:space="preserve"> Cho</w:t>
             </w:r>
           </w:p>
         </w:tc>
@@ -16279,8 +17728,21 @@
                 <w:lang w:val="en-ID"/>
                 <w14:ligatures w14:val="none"/>
               </w:rPr>
-              <w:t>Different opinions and different execution expertise of each members</w:t>
-            </w:r>
+              <w:t xml:space="preserve">Different opinions and different execution expertise of each </w:t>
+            </w:r>
+            <w:proofErr w:type="gramStart"/>
+            <w:r>
+              <w:rPr>
+                <w:rFonts w:ascii="Arial" w:eastAsia="Times New Roman" w:hAnsi="Arial" w:cs="Arial"/>
+                <w:color w:val="000000"/>
+                <w:kern w:val="0"/>
+                <w:szCs w:val="22"/>
+                <w:lang w:val="en-ID"/>
+                <w14:ligatures w14:val="none"/>
+              </w:rPr>
+              <w:t>members</w:t>
+            </w:r>
+            <w:proofErr w:type="gramEnd"/>
           </w:p>
         </w:tc>
         <w:tc>
@@ -16321,7 +17783,31 @@
                 <w:lang w:val="en-ID"/>
                 <w14:ligatures w14:val="none"/>
               </w:rPr>
-              <w:t>Multiple feedbacks that can construct a good quality of result</w:t>
+              <w:t xml:space="preserve">Multiple </w:t>
+            </w:r>
+            <w:proofErr w:type="gramStart"/>
+            <w:r>
+              <w:rPr>
+                <w:rFonts w:ascii="Arial" w:eastAsia="Times New Roman" w:hAnsi="Arial" w:cs="Arial"/>
+                <w:color w:val="000000"/>
+                <w:kern w:val="0"/>
+                <w:szCs w:val="22"/>
+                <w:lang w:val="en-ID"/>
+                <w14:ligatures w14:val="none"/>
+              </w:rPr>
+              <w:t>feedbacks</w:t>
+            </w:r>
+            <w:proofErr w:type="gramEnd"/>
+            <w:r>
+              <w:rPr>
+                <w:rFonts w:ascii="Arial" w:eastAsia="Times New Roman" w:hAnsi="Arial" w:cs="Arial"/>
+                <w:color w:val="000000"/>
+                <w:kern w:val="0"/>
+                <w:szCs w:val="22"/>
+                <w:lang w:val="en-ID"/>
+                <w14:ligatures w14:val="none"/>
+              </w:rPr>
+              <w:t xml:space="preserve"> that can construct a good quality of result</w:t>
             </w:r>
           </w:p>
         </w:tc>
@@ -16354,6 +17840,7 @@
                 <w14:ligatures w14:val="none"/>
               </w:rPr>
             </w:pPr>
+            <w:proofErr w:type="gramStart"/>
             <w:r>
               <w:rPr>
                 <w:rFonts w:ascii="Arial" w:eastAsia="Times New Roman" w:hAnsi="Arial" w:cs="Arial"/>
@@ -16363,7 +17850,19 @@
                 <w:lang w:val="en-ID"/>
                 <w14:ligatures w14:val="none"/>
               </w:rPr>
-              <w:t>Every perspectives are different and everyone is assigned to a task</w:t>
+              <w:t>Every</w:t>
+            </w:r>
+            <w:proofErr w:type="gramEnd"/>
+            <w:r>
+              <w:rPr>
+                <w:rFonts w:ascii="Arial" w:eastAsia="Times New Roman" w:hAnsi="Arial" w:cs="Arial"/>
+                <w:color w:val="000000"/>
+                <w:kern w:val="0"/>
+                <w:szCs w:val="22"/>
+                <w:lang w:val="en-ID"/>
+                <w14:ligatures w14:val="none"/>
+              </w:rPr>
+              <w:t xml:space="preserve"> perspectives are different and everyone is assigned to a task</w:t>
             </w:r>
           </w:p>
         </w:tc>
@@ -16593,7 +18092,31 @@
                 <w:lang w:val="en-ID"/>
                 <w14:ligatures w14:val="none"/>
               </w:rPr>
-              <w:t>Work are not shared evenly (note evenly is not equally)</w:t>
+              <w:t xml:space="preserve">Work </w:t>
+            </w:r>
+            <w:proofErr w:type="gramStart"/>
+            <w:r>
+              <w:rPr>
+                <w:rFonts w:ascii="Arial" w:eastAsia="Times New Roman" w:hAnsi="Arial" w:cs="Arial"/>
+                <w:color w:val="000000"/>
+                <w:kern w:val="0"/>
+                <w:szCs w:val="22"/>
+                <w:lang w:val="en-ID"/>
+                <w14:ligatures w14:val="none"/>
+              </w:rPr>
+              <w:t>are</w:t>
+            </w:r>
+            <w:proofErr w:type="gramEnd"/>
+            <w:r>
+              <w:rPr>
+                <w:rFonts w:ascii="Arial" w:eastAsia="Times New Roman" w:hAnsi="Arial" w:cs="Arial"/>
+                <w:color w:val="000000"/>
+                <w:kern w:val="0"/>
+                <w:szCs w:val="22"/>
+                <w:lang w:val="en-ID"/>
+                <w14:ligatures w14:val="none"/>
+              </w:rPr>
+              <w:t xml:space="preserve"> not shared evenly (note evenly is not equally)</w:t>
             </w:r>
           </w:p>
         </w:tc>
@@ -16677,7 +18200,31 @@
                 <w:lang w:val="en-ID"/>
                 <w14:ligatures w14:val="none"/>
               </w:rPr>
-              <w:t>Unresponsive teammates and lazy teammate that does not want to complete their part on time</w:t>
+              <w:t xml:space="preserve">Unresponsive teammates and lazy </w:t>
+            </w:r>
+            <w:proofErr w:type="gramStart"/>
+            <w:r>
+              <w:rPr>
+                <w:rFonts w:ascii="Arial" w:eastAsia="Times New Roman" w:hAnsi="Arial" w:cs="Arial"/>
+                <w:color w:val="000000"/>
+                <w:kern w:val="0"/>
+                <w:szCs w:val="22"/>
+                <w:lang w:val="en-ID"/>
+                <w14:ligatures w14:val="none"/>
+              </w:rPr>
+              <w:t>teammate</w:t>
+            </w:r>
+            <w:proofErr w:type="gramEnd"/>
+            <w:r>
+              <w:rPr>
+                <w:rFonts w:ascii="Arial" w:eastAsia="Times New Roman" w:hAnsi="Arial" w:cs="Arial"/>
+                <w:color w:val="000000"/>
+                <w:kern w:val="0"/>
+                <w:szCs w:val="22"/>
+                <w:lang w:val="en-ID"/>
+                <w14:ligatures w14:val="none"/>
+              </w:rPr>
+              <w:t xml:space="preserve"> that does not want to complete their part on time</w:t>
             </w:r>
           </w:p>
         </w:tc>
@@ -16962,7 +18509,31 @@
                 <w14:ligatures w14:val="none"/>
               </w:rPr>
               <w:lastRenderedPageBreak/>
-              <w:t xml:space="preserve">Everyone do their jobs and tell the others </w:t>
+              <w:t xml:space="preserve">Everyone </w:t>
+            </w:r>
+            <w:proofErr w:type="gramStart"/>
+            <w:r>
+              <w:rPr>
+                <w:rFonts w:ascii="Arial" w:eastAsia="Times New Roman" w:hAnsi="Arial" w:cs="Arial"/>
+                <w:color w:val="000000"/>
+                <w:kern w:val="0"/>
+                <w:szCs w:val="22"/>
+                <w:lang w:val="en-ID"/>
+                <w14:ligatures w14:val="none"/>
+              </w:rPr>
+              <w:t>do</w:t>
+            </w:r>
+            <w:proofErr w:type="gramEnd"/>
+            <w:r>
+              <w:rPr>
+                <w:rFonts w:ascii="Arial" w:eastAsia="Times New Roman" w:hAnsi="Arial" w:cs="Arial"/>
+                <w:color w:val="000000"/>
+                <w:kern w:val="0"/>
+                <w:szCs w:val="22"/>
+                <w:lang w:val="en-ID"/>
+                <w14:ligatures w14:val="none"/>
+              </w:rPr>
+              <w:t xml:space="preserve"> their jobs and tell the others </w:t>
             </w:r>
             <w:r>
               <w:rPr>
@@ -17072,7 +18643,31 @@
                 <w14:ligatures w14:val="none"/>
               </w:rPr>
               <w:lastRenderedPageBreak/>
-              <w:t>Everyone share their feedback correctly</w:t>
+              <w:t xml:space="preserve">Everyone </w:t>
+            </w:r>
+            <w:proofErr w:type="gramStart"/>
+            <w:r>
+              <w:rPr>
+                <w:rFonts w:ascii="Arial" w:eastAsia="Times New Roman" w:hAnsi="Arial" w:cs="Arial"/>
+                <w:color w:val="000000"/>
+                <w:kern w:val="0"/>
+                <w:szCs w:val="22"/>
+                <w:lang w:val="en-ID"/>
+                <w14:ligatures w14:val="none"/>
+              </w:rPr>
+              <w:t>share</w:t>
+            </w:r>
+            <w:proofErr w:type="gramEnd"/>
+            <w:r>
+              <w:rPr>
+                <w:rFonts w:ascii="Arial" w:eastAsia="Times New Roman" w:hAnsi="Arial" w:cs="Arial"/>
+                <w:color w:val="000000"/>
+                <w:kern w:val="0"/>
+                <w:szCs w:val="22"/>
+                <w:lang w:val="en-ID"/>
+                <w14:ligatures w14:val="none"/>
+              </w:rPr>
+              <w:t xml:space="preserve"> their feedback correctly</w:t>
             </w:r>
           </w:p>
         </w:tc>
@@ -19052,6 +20647,7 @@
                 <w14:ligatures w14:val="none"/>
               </w:rPr>
             </w:pPr>
+            <w:proofErr w:type="spellStart"/>
             <w:r>
               <w:rPr>
                 <w:rFonts w:ascii="Arial" w:eastAsia="Times New Roman" w:hAnsi="Arial" w:cs="Arial"/>
@@ -19061,7 +20657,19 @@
                 <w:lang w:val="en-ID"/>
                 <w14:ligatures w14:val="none"/>
               </w:rPr>
-              <w:t>Hangyeon: economical aspect</w:t>
+              <w:t>Hangyeon</w:t>
+            </w:r>
+            <w:proofErr w:type="spellEnd"/>
+            <w:r>
+              <w:rPr>
+                <w:rFonts w:ascii="Arial" w:eastAsia="Times New Roman" w:hAnsi="Arial" w:cs="Arial"/>
+                <w:color w:val="000000"/>
+                <w:kern w:val="0"/>
+                <w:szCs w:val="22"/>
+                <w:lang w:val="en-ID"/>
+                <w14:ligatures w14:val="none"/>
+              </w:rPr>
+              <w:t>: economical aspect</w:t>
             </w:r>
             <w:r>
               <w:rPr>
@@ -19337,58 +20945,9 @@
                 <w:lang w:val="en-ID"/>
                 <w14:ligatures w14:val="none"/>
               </w:rPr>
-              <w:t>UTS StudySpaces/Online Platform</w:t>
-            </w:r>
-          </w:p>
-          <w:p>
-            <w:pPr>
-              <w:spacing w:after="240" w:line="240" w:lineRule="auto"/>
-              <w:ind w:leftChars="0" w:left="0" w:firstLineChars="0" w:firstLine="0"/>
-              <w:rPr>
-                <w:rFonts w:ascii="Times New Roman" w:eastAsia="Times New Roman" w:hAnsi="Times New Roman" w:cs="Times New Roman"/>
-                <w:kern w:val="0"/>
-                <w:sz w:val="24"/>
-                <w:lang w:val="en-ID"/>
-                <w14:ligatures w14:val="none"/>
-              </w:rPr>
-            </w:pPr>
-          </w:p>
-          <w:p>
-            <w:pPr>
-              <w:spacing w:after="0" w:line="240" w:lineRule="auto"/>
-              <w:ind w:leftChars="0" w:left="0" w:firstLineChars="0" w:firstLine="0"/>
-              <w:rPr>
-                <w:rFonts w:ascii="Times New Roman" w:eastAsia="Times New Roman" w:hAnsi="Times New Roman" w:cs="Times New Roman"/>
-                <w:kern w:val="0"/>
-                <w:sz w:val="24"/>
-                <w:lang w:val="en-ID"/>
-                <w14:ligatures w14:val="none"/>
-              </w:rPr>
-            </w:pPr>
-            <w:r>
-              <w:rPr>
-                <w:rFonts w:ascii="Arial" w:eastAsia="Times New Roman" w:hAnsi="Arial" w:cs="Arial"/>
-                <w:color w:val="000000"/>
-                <w:kern w:val="0"/>
-                <w:szCs w:val="22"/>
-                <w:lang w:val="en-ID"/>
-                <w14:ligatures w14:val="none"/>
-              </w:rPr>
-              <w:t>On average, how long should our meetings be?</w:t>
-            </w:r>
-          </w:p>
-          <w:p>
-            <w:pPr>
-              <w:spacing w:after="0" w:line="240" w:lineRule="auto"/>
-              <w:ind w:leftChars="0" w:left="0" w:firstLineChars="0" w:firstLine="0"/>
-              <w:rPr>
-                <w:rFonts w:ascii="Times New Roman" w:eastAsia="Times New Roman" w:hAnsi="Times New Roman" w:cs="Times New Roman"/>
-                <w:kern w:val="0"/>
-                <w:sz w:val="24"/>
-                <w:lang w:val="en-ID"/>
-                <w14:ligatures w14:val="none"/>
-              </w:rPr>
-            </w:pPr>
+              <w:t xml:space="preserve">UTS </w:t>
+            </w:r>
+            <w:proofErr w:type="spellStart"/>
             <w:r>
               <w:rPr>
                 <w:rFonts w:ascii="Arial" w:eastAsia="Times New Roman" w:hAnsi="Arial" w:cs="Arial"/>
@@ -19400,59 +20959,9 @@
                 <w:lang w:val="en-ID"/>
                 <w14:ligatures w14:val="none"/>
               </w:rPr>
-              <w:t>1-2 Hours</w:t>
-            </w:r>
-          </w:p>
-          <w:p>
-            <w:pPr>
-              <w:spacing w:after="240" w:line="240" w:lineRule="auto"/>
-              <w:ind w:leftChars="0" w:left="0" w:firstLineChars="0" w:firstLine="0"/>
-              <w:rPr>
-                <w:rFonts w:ascii="Times New Roman" w:eastAsia="Times New Roman" w:hAnsi="Times New Roman" w:cs="Times New Roman"/>
-                <w:kern w:val="0"/>
-                <w:sz w:val="24"/>
-                <w:lang w:val="en-ID"/>
-                <w14:ligatures w14:val="none"/>
-              </w:rPr>
-            </w:pPr>
-          </w:p>
-          <w:p>
-            <w:pPr>
-              <w:spacing w:after="0" w:line="240" w:lineRule="auto"/>
-              <w:ind w:leftChars="0" w:left="0" w:firstLineChars="0" w:firstLine="0"/>
-              <w:rPr>
-                <w:rFonts w:ascii="Times New Roman" w:eastAsia="Times New Roman" w:hAnsi="Times New Roman" w:cs="Times New Roman"/>
-                <w:kern w:val="0"/>
-                <w:sz w:val="24"/>
-                <w:lang w:val="en-ID"/>
-                <w14:ligatures w14:val="none"/>
-              </w:rPr>
-            </w:pPr>
-            <w:r>
-              <w:rPr>
-                <w:rFonts w:ascii="Arial" w:eastAsia="Times New Roman" w:hAnsi="Arial" w:cs="Arial"/>
-                <w:color w:val="000000"/>
-                <w:kern w:val="0"/>
-                <w:szCs w:val="22"/>
-                <w:lang w:val="en-ID"/>
-                <w14:ligatures w14:val="none"/>
-              </w:rPr>
-              <w:lastRenderedPageBreak/>
-              <w:t>Where will our meetings take place?</w:t>
-            </w:r>
-          </w:p>
-          <w:p>
-            <w:pPr>
-              <w:spacing w:after="0" w:line="240" w:lineRule="auto"/>
-              <w:ind w:leftChars="0" w:left="0" w:firstLineChars="0" w:firstLine="0"/>
-              <w:rPr>
-                <w:rFonts w:ascii="Times New Roman" w:eastAsia="Times New Roman" w:hAnsi="Times New Roman" w:cs="Times New Roman"/>
-                <w:kern w:val="0"/>
-                <w:sz w:val="24"/>
-                <w:lang w:val="en-ID"/>
-                <w14:ligatures w14:val="none"/>
-              </w:rPr>
-            </w:pPr>
+              <w:t>StudySpaces</w:t>
+            </w:r>
+            <w:proofErr w:type="spellEnd"/>
             <w:r>
               <w:rPr>
                 <w:rFonts w:ascii="Arial" w:eastAsia="Times New Roman" w:hAnsi="Arial" w:cs="Arial"/>
@@ -19464,7 +20973,162 @@
                 <w:lang w:val="en-ID"/>
                 <w14:ligatures w14:val="none"/>
               </w:rPr>
-              <w:t>UTS StudySpaces/Online Platform</w:t>
+              <w:t>/Online Platform</w:t>
+            </w:r>
+          </w:p>
+          <w:p>
+            <w:pPr>
+              <w:spacing w:after="240" w:line="240" w:lineRule="auto"/>
+              <w:ind w:leftChars="0" w:left="0" w:firstLineChars="0" w:firstLine="0"/>
+              <w:rPr>
+                <w:rFonts w:ascii="Times New Roman" w:eastAsia="Times New Roman" w:hAnsi="Times New Roman" w:cs="Times New Roman"/>
+                <w:kern w:val="0"/>
+                <w:sz w:val="24"/>
+                <w:lang w:val="en-ID"/>
+                <w14:ligatures w14:val="none"/>
+              </w:rPr>
+            </w:pPr>
+          </w:p>
+          <w:p>
+            <w:pPr>
+              <w:spacing w:after="0" w:line="240" w:lineRule="auto"/>
+              <w:ind w:leftChars="0" w:left="0" w:firstLineChars="0" w:firstLine="0"/>
+              <w:rPr>
+                <w:rFonts w:ascii="Times New Roman" w:eastAsia="Times New Roman" w:hAnsi="Times New Roman" w:cs="Times New Roman"/>
+                <w:kern w:val="0"/>
+                <w:sz w:val="24"/>
+                <w:lang w:val="en-ID"/>
+                <w14:ligatures w14:val="none"/>
+              </w:rPr>
+            </w:pPr>
+            <w:r>
+              <w:rPr>
+                <w:rFonts w:ascii="Arial" w:eastAsia="Times New Roman" w:hAnsi="Arial" w:cs="Arial"/>
+                <w:color w:val="000000"/>
+                <w:kern w:val="0"/>
+                <w:szCs w:val="22"/>
+                <w:lang w:val="en-ID"/>
+                <w14:ligatures w14:val="none"/>
+              </w:rPr>
+              <w:t>On average, how long should our meetings be?</w:t>
+            </w:r>
+          </w:p>
+          <w:p>
+            <w:pPr>
+              <w:spacing w:after="0" w:line="240" w:lineRule="auto"/>
+              <w:ind w:leftChars="0" w:left="0" w:firstLineChars="0" w:firstLine="0"/>
+              <w:rPr>
+                <w:rFonts w:ascii="Times New Roman" w:eastAsia="Times New Roman" w:hAnsi="Times New Roman" w:cs="Times New Roman"/>
+                <w:kern w:val="0"/>
+                <w:sz w:val="24"/>
+                <w:lang w:val="en-ID"/>
+                <w14:ligatures w14:val="none"/>
+              </w:rPr>
+            </w:pPr>
+            <w:r>
+              <w:rPr>
+                <w:rFonts w:ascii="Arial" w:eastAsia="Times New Roman" w:hAnsi="Arial" w:cs="Arial"/>
+                <w:b/>
+                <w:bCs/>
+                <w:color w:val="000000"/>
+                <w:kern w:val="0"/>
+                <w:szCs w:val="22"/>
+                <w:lang w:val="en-ID"/>
+                <w14:ligatures w14:val="none"/>
+              </w:rPr>
+              <w:t>1-2 Hours</w:t>
+            </w:r>
+          </w:p>
+          <w:p>
+            <w:pPr>
+              <w:spacing w:after="240" w:line="240" w:lineRule="auto"/>
+              <w:ind w:leftChars="0" w:left="0" w:firstLineChars="0" w:firstLine="0"/>
+              <w:rPr>
+                <w:rFonts w:ascii="Times New Roman" w:eastAsia="Times New Roman" w:hAnsi="Times New Roman" w:cs="Times New Roman"/>
+                <w:kern w:val="0"/>
+                <w:sz w:val="24"/>
+                <w:lang w:val="en-ID"/>
+                <w14:ligatures w14:val="none"/>
+              </w:rPr>
+            </w:pPr>
+          </w:p>
+          <w:p>
+            <w:pPr>
+              <w:spacing w:after="0" w:line="240" w:lineRule="auto"/>
+              <w:ind w:leftChars="0" w:left="0" w:firstLineChars="0" w:firstLine="0"/>
+              <w:rPr>
+                <w:rFonts w:ascii="Times New Roman" w:eastAsia="Times New Roman" w:hAnsi="Times New Roman" w:cs="Times New Roman"/>
+                <w:kern w:val="0"/>
+                <w:sz w:val="24"/>
+                <w:lang w:val="en-ID"/>
+                <w14:ligatures w14:val="none"/>
+              </w:rPr>
+            </w:pPr>
+            <w:r>
+              <w:rPr>
+                <w:rFonts w:ascii="Arial" w:eastAsia="Times New Roman" w:hAnsi="Arial" w:cs="Arial"/>
+                <w:color w:val="000000"/>
+                <w:kern w:val="0"/>
+                <w:szCs w:val="22"/>
+                <w:lang w:val="en-ID"/>
+                <w14:ligatures w14:val="none"/>
+              </w:rPr>
+              <w:lastRenderedPageBreak/>
+              <w:t>Where will our meetings take place?</w:t>
+            </w:r>
+          </w:p>
+          <w:p>
+            <w:pPr>
+              <w:spacing w:after="0" w:line="240" w:lineRule="auto"/>
+              <w:ind w:leftChars="0" w:left="0" w:firstLineChars="0" w:firstLine="0"/>
+              <w:rPr>
+                <w:rFonts w:ascii="Times New Roman" w:eastAsia="Times New Roman" w:hAnsi="Times New Roman" w:cs="Times New Roman"/>
+                <w:kern w:val="0"/>
+                <w:sz w:val="24"/>
+                <w:lang w:val="en-ID"/>
+                <w14:ligatures w14:val="none"/>
+              </w:rPr>
+            </w:pPr>
+            <w:r>
+              <w:rPr>
+                <w:rFonts w:ascii="Arial" w:eastAsia="Times New Roman" w:hAnsi="Arial" w:cs="Arial"/>
+                <w:b/>
+                <w:bCs/>
+                <w:color w:val="000000"/>
+                <w:kern w:val="0"/>
+                <w:szCs w:val="22"/>
+                <w:lang w:val="en-ID"/>
+                <w14:ligatures w14:val="none"/>
+              </w:rPr>
+              <w:t xml:space="preserve">UTS </w:t>
+            </w:r>
+            <w:proofErr w:type="spellStart"/>
+            <w:r>
+              <w:rPr>
+                <w:rFonts w:ascii="Arial" w:eastAsia="Times New Roman" w:hAnsi="Arial" w:cs="Arial"/>
+                <w:b/>
+                <w:bCs/>
+                <w:color w:val="000000"/>
+                <w:kern w:val="0"/>
+                <w:szCs w:val="22"/>
+                <w:lang w:val="en-ID"/>
+                <w14:ligatures w14:val="none"/>
+              </w:rPr>
+              <w:t>StudySpaces</w:t>
+            </w:r>
+            <w:proofErr w:type="spellEnd"/>
+            <w:r>
+              <w:rPr>
+                <w:rFonts w:ascii="Arial" w:eastAsia="Times New Roman" w:hAnsi="Arial" w:cs="Arial"/>
+                <w:b/>
+                <w:bCs/>
+                <w:color w:val="000000"/>
+                <w:kern w:val="0"/>
+                <w:szCs w:val="22"/>
+                <w:lang w:val="en-ID"/>
+                <w14:ligatures w14:val="none"/>
+              </w:rPr>
+              <w:t>/Online Platform</w:t>
             </w:r>
           </w:p>
           <w:p>
@@ -20564,6 +22228,7 @@
               </w:rPr>
               <w:t xml:space="preserve">Gleeny </w:t>
             </w:r>
+            <w:proofErr w:type="spellStart"/>
             <w:r>
               <w:rPr>
                 <w:rFonts w:ascii="Arial" w:eastAsia="Times New Roman" w:hAnsi="Arial" w:cs="Arial"/>
@@ -20575,6 +22240,7 @@
               </w:rPr>
               <w:t>Veneesha</w:t>
             </w:r>
+            <w:proofErr w:type="spellEnd"/>
             <w:r>
               <w:rPr>
                 <w:rFonts w:ascii="Arial" w:eastAsia="Times New Roman" w:hAnsi="Arial" w:cs="Arial"/>
@@ -20612,6 +22278,7 @@
                 <w14:ligatures w14:val="none"/>
               </w:rPr>
             </w:pPr>
+            <w:proofErr w:type="spellStart"/>
             <w:r>
               <w:rPr>
                 <w:rFonts w:ascii="Arial" w:eastAsia="Times New Roman" w:hAnsi="Arial" w:cs="Arial"/>
@@ -20621,8 +22288,33 @@
                 <w:lang w:val="en-ID"/>
                 <w14:ligatures w14:val="none"/>
               </w:rPr>
-              <w:t>Hangyeon Cho                 Hangyeon</w:t>
-            </w:r>
+              <w:t>Hangyeon</w:t>
+            </w:r>
+            <w:proofErr w:type="spellEnd"/>
+            <w:r>
+              <w:rPr>
+                <w:rFonts w:ascii="Arial" w:eastAsia="Times New Roman" w:hAnsi="Arial" w:cs="Arial"/>
+                <w:color w:val="000000"/>
+                <w:kern w:val="0"/>
+                <w:szCs w:val="22"/>
+                <w:lang w:val="en-ID"/>
+                <w14:ligatures w14:val="none"/>
+              </w:rPr>
+              <w:t xml:space="preserve"> Cho                 </w:t>
+            </w:r>
+            <w:proofErr w:type="spellStart"/>
+            <w:r>
+              <w:rPr>
+                <w:rFonts w:ascii="Arial" w:eastAsia="Times New Roman" w:hAnsi="Arial" w:cs="Arial"/>
+                <w:color w:val="000000"/>
+                <w:kern w:val="0"/>
+                <w:szCs w:val="22"/>
+                <w:lang w:val="en-ID"/>
+                <w14:ligatures w14:val="none"/>
+              </w:rPr>
+              <w:t>Hangyeon</w:t>
+            </w:r>
+            <w:proofErr w:type="spellEnd"/>
           </w:p>
           <w:p>
             <w:pPr>
@@ -20849,8 +22541,16 @@
               <w:rPr>
                 <w:sz w:val="24"/>
               </w:rPr>
-              <w:t>Date and Time</w:t>
-            </w:r>
+              <w:t xml:space="preserve">Date and </w:t>
+            </w:r>
+            <w:proofErr w:type="gramStart"/>
+            <w:r>
+              <w:rPr>
+                <w:sz w:val="24"/>
+              </w:rPr>
+              <w:t>Time</w:t>
+            </w:r>
+            <w:proofErr w:type="gramEnd"/>
           </w:p>
         </w:tc>
         <w:tc>
@@ -21013,11 +22713,19 @@
                 <w:sz w:val="24"/>
               </w:rPr>
             </w:pPr>
-            <w:r>
-              <w:rPr>
-                <w:sz w:val="24"/>
-              </w:rPr>
-              <w:t xml:space="preserve">Hangyeon Cho, </w:t>
+            <w:proofErr w:type="spellStart"/>
+            <w:r>
+              <w:rPr>
+                <w:sz w:val="24"/>
+              </w:rPr>
+              <w:t>Hangyeon</w:t>
+            </w:r>
+            <w:proofErr w:type="spellEnd"/>
+            <w:r>
+              <w:rPr>
+                <w:sz w:val="24"/>
+              </w:rPr>
+              <w:t xml:space="preserve"> Cho, </w:t>
             </w:r>
           </w:p>
           <w:p>
@@ -21039,12 +22747,14 @@
               </w:rPr>
               <w:t xml:space="preserve">Glenny </w:t>
             </w:r>
+            <w:proofErr w:type="spellStart"/>
             <w:r>
               <w:rPr>
                 <w:sz w:val="24"/>
               </w:rPr>
               <w:t>Veneesha</w:t>
             </w:r>
+            <w:proofErr w:type="spellEnd"/>
             <w:r>
               <w:rPr>
                 <w:sz w:val="24"/>
@@ -21098,12 +22808,14 @@
                 <w:sz w:val="24"/>
               </w:rPr>
             </w:pPr>
+            <w:proofErr w:type="spellStart"/>
             <w:r>
               <w:rPr>
                 <w:sz w:val="24"/>
               </w:rPr>
               <w:t>Organiser</w:t>
             </w:r>
+            <w:proofErr w:type="spellEnd"/>
           </w:p>
         </w:tc>
         <w:tc>
@@ -21477,7 +23189,21 @@
               <w:rPr>
                 <w:sz w:val="24"/>
               </w:rPr>
-              <w:t>Create Introduction to Lama Lama Country and Background Research</w:t>
+              <w:t xml:space="preserve">Create Introduction to Lama </w:t>
+            </w:r>
+            <w:proofErr w:type="spellStart"/>
+            <w:r>
+              <w:rPr>
+                <w:sz w:val="24"/>
+              </w:rPr>
+              <w:t>Lama</w:t>
+            </w:r>
+            <w:proofErr w:type="spellEnd"/>
+            <w:r>
+              <w:rPr>
+                <w:sz w:val="24"/>
+              </w:rPr>
+              <w:t xml:space="preserve"> Country and Background Research</w:t>
             </w:r>
           </w:p>
         </w:tc>
@@ -21596,12 +23322,14 @@
               </w:rPr>
               <w:t xml:space="preserve">Glenny </w:t>
             </w:r>
+            <w:proofErr w:type="spellStart"/>
             <w:r>
               <w:rPr>
                 <w:sz w:val="24"/>
               </w:rPr>
               <w:t>Veneesha</w:t>
             </w:r>
+            <w:proofErr w:type="spellEnd"/>
           </w:p>
         </w:tc>
         <w:tc>
@@ -21778,11 +23506,19 @@
                 <w:sz w:val="24"/>
               </w:rPr>
             </w:pPr>
-            <w:r>
-              <w:rPr>
-                <w:sz w:val="24"/>
-              </w:rPr>
-              <w:t>Hangyeon Cho</w:t>
+            <w:proofErr w:type="spellStart"/>
+            <w:r>
+              <w:rPr>
+                <w:sz w:val="24"/>
+              </w:rPr>
+              <w:t>Hangyeon</w:t>
+            </w:r>
+            <w:proofErr w:type="spellEnd"/>
+            <w:r>
+              <w:rPr>
+                <w:sz w:val="24"/>
+              </w:rPr>
+              <w:t xml:space="preserve"> Cho</w:t>
             </w:r>
           </w:p>
         </w:tc>
@@ -22204,7 +23940,21 @@
         <w:rPr>
           <w:sz w:val="24"/>
         </w:rPr>
-        <w:t>The group agreed to use a consistent visual theme and formatting across all website pages.</w:t>
+        <w:t xml:space="preserve">The group agreed to use a consistent visual theme and </w:t>
+      </w:r>
+      <w:proofErr w:type="gramStart"/>
+      <w:r>
+        <w:rPr>
+          <w:sz w:val="24"/>
+        </w:rPr>
+        <w:t>formatting</w:t>
+      </w:r>
+      <w:proofErr w:type="gramEnd"/>
+      <w:r>
+        <w:rPr>
+          <w:sz w:val="24"/>
+        </w:rPr>
+        <w:t xml:space="preserve"> across all website pages.</w:t>
       </w:r>
     </w:p>
     <w:p>
@@ -22339,8 +24089,16 @@
               <w:rPr>
                 <w:sz w:val="24"/>
               </w:rPr>
-              <w:t>Date and Time</w:t>
-            </w:r>
+              <w:t xml:space="preserve">Date and </w:t>
+            </w:r>
+            <w:proofErr w:type="gramStart"/>
+            <w:r>
+              <w:rPr>
+                <w:sz w:val="24"/>
+              </w:rPr>
+              <w:t>Time</w:t>
+            </w:r>
+            <w:proofErr w:type="gramEnd"/>
           </w:p>
         </w:tc>
         <w:tc>
@@ -22503,11 +24261,19 @@
                 <w:sz w:val="24"/>
               </w:rPr>
             </w:pPr>
-            <w:r>
-              <w:rPr>
-                <w:sz w:val="24"/>
-              </w:rPr>
-              <w:t xml:space="preserve">Hangyeon Cho, </w:t>
+            <w:proofErr w:type="spellStart"/>
+            <w:r>
+              <w:rPr>
+                <w:sz w:val="24"/>
+              </w:rPr>
+              <w:t>Hangyeon</w:t>
+            </w:r>
+            <w:proofErr w:type="spellEnd"/>
+            <w:r>
+              <w:rPr>
+                <w:sz w:val="24"/>
+              </w:rPr>
+              <w:t xml:space="preserve"> Cho, </w:t>
             </w:r>
           </w:p>
           <w:p>
@@ -22529,12 +24295,14 @@
               </w:rPr>
               <w:t xml:space="preserve">Glenny </w:t>
             </w:r>
+            <w:proofErr w:type="spellStart"/>
             <w:r>
               <w:rPr>
                 <w:sz w:val="24"/>
               </w:rPr>
               <w:t>Veneesha</w:t>
             </w:r>
+            <w:proofErr w:type="spellEnd"/>
             <w:r>
               <w:rPr>
                 <w:sz w:val="24"/>
@@ -22588,12 +24356,14 @@
                 <w:sz w:val="24"/>
               </w:rPr>
             </w:pPr>
+            <w:proofErr w:type="spellStart"/>
             <w:r>
               <w:rPr>
                 <w:sz w:val="24"/>
               </w:rPr>
               <w:t>Organiser</w:t>
             </w:r>
+            <w:proofErr w:type="spellEnd"/>
           </w:p>
         </w:tc>
         <w:tc>
@@ -22675,8 +24445,16 @@
               <w:rPr>
                 <w:sz w:val="24"/>
               </w:rPr>
-              <w:t>Glenny Veneesha</w:t>
-            </w:r>
+              <w:t xml:space="preserve">Glenny </w:t>
+            </w:r>
+            <w:proofErr w:type="spellStart"/>
+            <w:r>
+              <w:rPr>
+                <w:sz w:val="24"/>
+              </w:rPr>
+              <w:t>Veneesha</w:t>
+            </w:r>
+            <w:proofErr w:type="spellEnd"/>
           </w:p>
         </w:tc>
       </w:tr>
@@ -23121,12 +24899,14 @@
               </w:rPr>
               <w:t xml:space="preserve">Glenny </w:t>
             </w:r>
+            <w:proofErr w:type="spellStart"/>
             <w:r>
               <w:rPr>
                 <w:sz w:val="24"/>
               </w:rPr>
               <w:t>Veneesha</w:t>
             </w:r>
+            <w:proofErr w:type="spellEnd"/>
           </w:p>
         </w:tc>
         <w:tc>
@@ -23304,11 +25084,19 @@
                 <w:sz w:val="24"/>
               </w:rPr>
             </w:pPr>
-            <w:r>
-              <w:rPr>
-                <w:sz w:val="24"/>
-              </w:rPr>
-              <w:t>Hangyeon Cho</w:t>
+            <w:proofErr w:type="spellStart"/>
+            <w:r>
+              <w:rPr>
+                <w:sz w:val="24"/>
+              </w:rPr>
+              <w:t>Hangyeon</w:t>
+            </w:r>
+            <w:proofErr w:type="spellEnd"/>
+            <w:r>
+              <w:rPr>
+                <w:sz w:val="24"/>
+              </w:rPr>
+              <w:t xml:space="preserve"> Cho</w:t>
             </w:r>
           </w:p>
         </w:tc>
@@ -23782,8 +25570,16 @@
               <w:rPr>
                 <w:sz w:val="24"/>
               </w:rPr>
-              <w:t>Date and Time</w:t>
-            </w:r>
+              <w:t xml:space="preserve">Date and </w:t>
+            </w:r>
+            <w:proofErr w:type="gramStart"/>
+            <w:r>
+              <w:rPr>
+                <w:sz w:val="24"/>
+              </w:rPr>
+              <w:t>Time</w:t>
+            </w:r>
+            <w:proofErr w:type="gramEnd"/>
           </w:p>
         </w:tc>
         <w:tc>
@@ -23946,11 +25742,19 @@
                 <w:sz w:val="24"/>
               </w:rPr>
             </w:pPr>
-            <w:r>
-              <w:rPr>
-                <w:sz w:val="24"/>
-              </w:rPr>
-              <w:t xml:space="preserve">Hangyeon Cho, </w:t>
+            <w:proofErr w:type="spellStart"/>
+            <w:r>
+              <w:rPr>
+                <w:sz w:val="24"/>
+              </w:rPr>
+              <w:t>Hangyeon</w:t>
+            </w:r>
+            <w:proofErr w:type="spellEnd"/>
+            <w:r>
+              <w:rPr>
+                <w:sz w:val="24"/>
+              </w:rPr>
+              <w:t xml:space="preserve"> Cho, </w:t>
             </w:r>
           </w:p>
           <w:p>
@@ -23972,12 +25776,14 @@
               </w:rPr>
               <w:t xml:space="preserve">Glenny </w:t>
             </w:r>
+            <w:proofErr w:type="spellStart"/>
             <w:r>
               <w:rPr>
                 <w:sz w:val="24"/>
               </w:rPr>
               <w:t>Veneesha</w:t>
             </w:r>
+            <w:proofErr w:type="spellEnd"/>
             <w:r>
               <w:rPr>
                 <w:sz w:val="24"/>
@@ -24031,12 +25837,14 @@
                 <w:sz w:val="24"/>
               </w:rPr>
             </w:pPr>
+            <w:proofErr w:type="spellStart"/>
             <w:r>
               <w:rPr>
                 <w:sz w:val="24"/>
               </w:rPr>
               <w:t>Organiser</w:t>
             </w:r>
+            <w:proofErr w:type="spellEnd"/>
           </w:p>
         </w:tc>
         <w:tc>
@@ -25859,7 +27667,7 @@
           <w:noProof/>
         </w:rPr>
         <w:drawing>
-          <wp:inline distT="0" distB="0" distL="0" distR="0" wp14:anchorId="1278C31A" wp14:editId="1826EAF3">
+          <wp:inline distT="0" distB="0" distL="0" distR="0" wp14:anchorId="1278C31A" wp14:editId="6DFC2C9A">
             <wp:extent cx="5285499" cy="4066309"/>
             <wp:effectExtent l="0" t="0" r="0" b="0"/>
             <wp:docPr id="497269555" name="Picture 1"/>
@@ -31869,7 +33677,6 @@
   <w:style w:type="character" w:default="1" w:styleId="DefaultParagraphFont">
     <w:name w:val="Default Paragraph Font"/>
     <w:uiPriority w:val="1"/>
-    <w:semiHidden/>
     <w:unhideWhenUsed/>
   </w:style>
   <w:style w:type="table" w:default="1" w:styleId="TableNormal">
@@ -32469,6 +34276,8 @@
     <w:rsid w:val="006B3C79"/>
     <w:rsid w:val="007E4AE2"/>
     <w:rsid w:val="009B69EB"/>
+    <w:rsid w:val="00A30F10"/>
+    <w:rsid w:val="00B74924"/>
     <w:rsid w:val="00D70935"/>
     <w:rsid w:val="00EB6D4B"/>
     <w:rsid w:val="00EF41F1"/>

</xml_diff>